<commit_message>
refactor: update column names for clarity in SQL and documentation
</commit_message>
<xml_diff>
--- a/Task_5/dw_5.docx
+++ b/Task_5/dw_5.docx
@@ -130,7 +130,29 @@
           <w:szCs w:val="24"/>
           <w:lang w:val="ru-RU"/>
         </w:rPr>
-        <w:t>общую и категорийную выручку;</w:t>
+        <w:t xml:space="preserve">общую и </w:t>
+      </w:r>
+      <w:proofErr w:type="spellStart"/>
+      <w:r>
+        <w:rPr>
+          <w:rFonts w:ascii="Times New Roman" w:hAnsi="Times New Roman" w:cs="Times New Roman"/>
+          <w:color w:val="000000" w:themeColor="text1"/>
+          <w:sz w:val="24"/>
+          <w:szCs w:val="24"/>
+          <w:lang w:val="ru-RU"/>
+        </w:rPr>
+        <w:t>категорийную</w:t>
+      </w:r>
+      <w:proofErr w:type="spellEnd"/>
+      <w:r>
+        <w:rPr>
+          <w:rFonts w:ascii="Times New Roman" w:hAnsi="Times New Roman" w:cs="Times New Roman"/>
+          <w:color w:val="000000" w:themeColor="text1"/>
+          <w:sz w:val="24"/>
+          <w:szCs w:val="24"/>
+          <w:lang w:val="ru-RU"/>
+        </w:rPr>
+        <w:t xml:space="preserve"> выручку;</w:t>
       </w:r>
     </w:p>
     <w:p>
@@ -279,6 +301,7 @@
           <w:lang w:val="ru-RU"/>
         </w:rPr>
       </w:pPr>
+      <w:proofErr w:type="spellStart"/>
       <w:r>
         <w:rPr>
           <w:rFonts w:ascii="Times New Roman" w:hAnsi="Times New Roman" w:cs="Times New Roman"/>
@@ -287,7 +310,18 @@
           <w:szCs w:val="24"/>
           <w:lang w:val="ru-RU"/>
         </w:rPr>
-        <w:t xml:space="preserve">Grain: одна строка таблицы фактов соответствует одной позиции </w:t>
+        <w:t>Grain</w:t>
+      </w:r>
+      <w:proofErr w:type="spellEnd"/>
+      <w:r>
+        <w:rPr>
+          <w:rFonts w:ascii="Times New Roman" w:hAnsi="Times New Roman" w:cs="Times New Roman"/>
+          <w:color w:val="000000" w:themeColor="text1"/>
+          <w:sz w:val="24"/>
+          <w:szCs w:val="24"/>
+          <w:lang w:val="ru-RU"/>
+        </w:rPr>
+        <w:t xml:space="preserve">: одна строка таблицы фактов соответствует одной позиции </w:t>
       </w:r>
       <w:r>
         <w:rPr>
@@ -329,7 +363,29 @@
           <w:szCs w:val="24"/>
           <w:lang w:val="ru-RU"/>
         </w:rPr>
-        <w:t>ыбранный grain позволяет:</w:t>
+        <w:t xml:space="preserve">ыбранный </w:t>
+      </w:r>
+      <w:proofErr w:type="spellStart"/>
+      <w:r>
+        <w:rPr>
+          <w:rFonts w:ascii="Times New Roman" w:hAnsi="Times New Roman" w:cs="Times New Roman"/>
+          <w:color w:val="000000" w:themeColor="text1"/>
+          <w:sz w:val="24"/>
+          <w:szCs w:val="24"/>
+          <w:lang w:val="ru-RU"/>
+        </w:rPr>
+        <w:t>grain</w:t>
+      </w:r>
+      <w:proofErr w:type="spellEnd"/>
+      <w:r>
+        <w:rPr>
+          <w:rFonts w:ascii="Times New Roman" w:hAnsi="Times New Roman" w:cs="Times New Roman"/>
+          <w:color w:val="000000" w:themeColor="text1"/>
+          <w:sz w:val="24"/>
+          <w:szCs w:val="24"/>
+          <w:lang w:val="ru-RU"/>
+        </w:rPr>
+        <w:t xml:space="preserve"> позволяет:</w:t>
       </w:r>
     </w:p>
     <w:p>
@@ -430,8 +486,39 @@
           <w:sz w:val="24"/>
           <w:szCs w:val="24"/>
         </w:rPr>
-        <w:t>Part 2. Таблицы измерений</w:t>
-      </w:r>
+        <w:t xml:space="preserve">Part 2. </w:t>
+      </w:r>
+      <w:proofErr w:type="spellStart"/>
+      <w:r>
+        <w:rPr>
+          <w:rFonts w:ascii="Times New Roman" w:hAnsi="Times New Roman" w:cs="Times New Roman"/>
+          <w:color w:val="000000" w:themeColor="text1"/>
+          <w:sz w:val="24"/>
+          <w:szCs w:val="24"/>
+        </w:rPr>
+        <w:t>Таблицы</w:t>
+      </w:r>
+      <w:proofErr w:type="spellEnd"/>
+      <w:r>
+        <w:rPr>
+          <w:rFonts w:ascii="Times New Roman" w:hAnsi="Times New Roman" w:cs="Times New Roman"/>
+          <w:color w:val="000000" w:themeColor="text1"/>
+          <w:sz w:val="24"/>
+          <w:szCs w:val="24"/>
+        </w:rPr>
+        <w:t xml:space="preserve"> </w:t>
+      </w:r>
+      <w:proofErr w:type="spellStart"/>
+      <w:r>
+        <w:rPr>
+          <w:rFonts w:ascii="Times New Roman" w:hAnsi="Times New Roman" w:cs="Times New Roman"/>
+          <w:color w:val="000000" w:themeColor="text1"/>
+          <w:sz w:val="24"/>
+          <w:szCs w:val="24"/>
+        </w:rPr>
+        <w:t>измерений</w:t>
+      </w:r>
+      <w:proofErr w:type="spellEnd"/>
     </w:p>
     <w:p>
       <w:pPr>
@@ -443,6 +530,7 @@
           <w:szCs w:val="24"/>
         </w:rPr>
       </w:pPr>
+      <w:proofErr w:type="spellStart"/>
       <w:r>
         <w:rPr>
           <w:rFonts w:ascii="Times New Roman" w:hAnsi="Times New Roman" w:cs="Times New Roman"/>
@@ -452,6 +540,7 @@
         </w:rPr>
         <w:t>Dim_Date</w:t>
       </w:r>
+      <w:proofErr w:type="spellEnd"/>
     </w:p>
     <w:p>
       <w:pPr>
@@ -564,12 +653,6 @@
         <w:gridCol w:w="4200"/>
       </w:tblGrid>
       <w:tr>
-        <w:tblPrEx>
-          <w:tblCellMar>
-            <w:top w:w="0" w:type="dxa"/>
-            <w:bottom w:w="0" w:type="dxa"/>
-          </w:tblCellMar>
-        </w:tblPrEx>
         <w:trPr>
           <w:tblHeader/>
         </w:trPr>
@@ -587,6 +670,7 @@
                 <w:szCs w:val="24"/>
               </w:rPr>
             </w:pPr>
+            <w:proofErr w:type="spellStart"/>
             <w:r>
               <w:rPr>
                 <w:rFonts w:ascii="Times New Roman" w:hAnsi="Times New Roman" w:cs="Times New Roman"/>
@@ -598,6 +682,7 @@
               </w:rPr>
               <w:t>Атрибут</w:t>
             </w:r>
+            <w:proofErr w:type="spellEnd"/>
           </w:p>
         </w:tc>
         <w:tc>
@@ -614,6 +699,7 @@
                 <w:szCs w:val="24"/>
               </w:rPr>
             </w:pPr>
+            <w:proofErr w:type="spellStart"/>
             <w:r>
               <w:rPr>
                 <w:rFonts w:ascii="Times New Roman" w:hAnsi="Times New Roman" w:cs="Times New Roman"/>
@@ -623,24 +709,9 @@
                 <w:sz w:val="24"/>
                 <w:szCs w:val="24"/>
               </w:rPr>
-              <w:t>Тип / ключ</w:t>
-            </w:r>
-          </w:p>
-        </w:tc>
-        <w:tc>
-          <w:tcPr>
-            <w:tcW w:w="4200" w:type="dxa"/>
-            <w:shd w:val="clear" w:color="auto" w:fill="auto"/>
-          </w:tcPr>
-          <w:p>
-            <w:pPr>
-              <w:rPr>
-                <w:rFonts w:ascii="Times New Roman" w:hAnsi="Times New Roman" w:cs="Times New Roman"/>
-                <w:color w:val="000000" w:themeColor="text1"/>
-                <w:sz w:val="24"/>
-                <w:szCs w:val="24"/>
-              </w:rPr>
-            </w:pPr>
+              <w:t>Тип</w:t>
+            </w:r>
+            <w:proofErr w:type="spellEnd"/>
             <w:r>
               <w:rPr>
                 <w:rFonts w:ascii="Times New Roman" w:hAnsi="Times New Roman" w:cs="Times New Roman"/>
@@ -650,18 +721,54 @@
                 <w:sz w:val="24"/>
                 <w:szCs w:val="24"/>
               </w:rPr>
+              <w:t xml:space="preserve"> / </w:t>
+            </w:r>
+            <w:proofErr w:type="spellStart"/>
+            <w:r>
+              <w:rPr>
+                <w:rFonts w:ascii="Times New Roman" w:hAnsi="Times New Roman" w:cs="Times New Roman"/>
+                <w:b/>
+                <w:bCs/>
+                <w:color w:val="000000" w:themeColor="text1"/>
+                <w:sz w:val="24"/>
+                <w:szCs w:val="24"/>
+              </w:rPr>
+              <w:t>ключ</w:t>
+            </w:r>
+            <w:proofErr w:type="spellEnd"/>
+          </w:p>
+        </w:tc>
+        <w:tc>
+          <w:tcPr>
+            <w:tcW w:w="4200" w:type="dxa"/>
+            <w:shd w:val="clear" w:color="auto" w:fill="auto"/>
+          </w:tcPr>
+          <w:p>
+            <w:pPr>
+              <w:rPr>
+                <w:rFonts w:ascii="Times New Roman" w:hAnsi="Times New Roman" w:cs="Times New Roman"/>
+                <w:color w:val="000000" w:themeColor="text1"/>
+                <w:sz w:val="24"/>
+                <w:szCs w:val="24"/>
+              </w:rPr>
+            </w:pPr>
+            <w:proofErr w:type="spellStart"/>
+            <w:r>
+              <w:rPr>
+                <w:rFonts w:ascii="Times New Roman" w:hAnsi="Times New Roman" w:cs="Times New Roman"/>
+                <w:b/>
+                <w:bCs/>
+                <w:color w:val="000000" w:themeColor="text1"/>
+                <w:sz w:val="24"/>
+                <w:szCs w:val="24"/>
+              </w:rPr>
               <w:t>Описание</w:t>
             </w:r>
+            <w:proofErr w:type="spellEnd"/>
           </w:p>
         </w:tc>
       </w:tr>
       <w:tr>
-        <w:tblPrEx>
-          <w:tblCellMar>
-            <w:top w:w="0" w:type="dxa"/>
-            <w:bottom w:w="0" w:type="dxa"/>
-          </w:tblCellMar>
-        </w:tblPrEx>
         <w:tc>
           <w:tcPr>
             <w:tcW w:w="2600" w:type="dxa"/>
@@ -676,6 +783,7 @@
                 <w:szCs w:val="24"/>
               </w:rPr>
             </w:pPr>
+            <w:proofErr w:type="spellStart"/>
             <w:r>
               <w:rPr>
                 <w:rFonts w:ascii="Times New Roman" w:eastAsia="Consolas" w:hAnsi="Times New Roman" w:cs="Times New Roman"/>
@@ -685,6 +793,7 @@
               </w:rPr>
               <w:t>date_key</w:t>
             </w:r>
+            <w:proofErr w:type="spellEnd"/>
           </w:p>
         </w:tc>
         <w:tc>
@@ -726,25 +835,50 @@
                 <w:szCs w:val="24"/>
               </w:rPr>
             </w:pPr>
-            <w:r>
-              <w:rPr>
-                <w:rFonts w:ascii="Times New Roman" w:hAnsi="Times New Roman" w:cs="Times New Roman"/>
-                <w:color w:val="000000" w:themeColor="text1"/>
-                <w:sz w:val="24"/>
-                <w:szCs w:val="24"/>
-              </w:rPr>
-              <w:t>Дата в формате YYYYMMDD</w:t>
+            <w:proofErr w:type="spellStart"/>
+            <w:r>
+              <w:rPr>
+                <w:rFonts w:ascii="Times New Roman" w:hAnsi="Times New Roman" w:cs="Times New Roman"/>
+                <w:color w:val="000000" w:themeColor="text1"/>
+                <w:sz w:val="24"/>
+                <w:szCs w:val="24"/>
+              </w:rPr>
+              <w:t>Дата</w:t>
+            </w:r>
+            <w:proofErr w:type="spellEnd"/>
+            <w:r>
+              <w:rPr>
+                <w:rFonts w:ascii="Times New Roman" w:hAnsi="Times New Roman" w:cs="Times New Roman"/>
+                <w:color w:val="000000" w:themeColor="text1"/>
+                <w:sz w:val="24"/>
+                <w:szCs w:val="24"/>
+              </w:rPr>
+              <w:t xml:space="preserve"> в </w:t>
+            </w:r>
+            <w:proofErr w:type="spellStart"/>
+            <w:r>
+              <w:rPr>
+                <w:rFonts w:ascii="Times New Roman" w:hAnsi="Times New Roman" w:cs="Times New Roman"/>
+                <w:color w:val="000000" w:themeColor="text1"/>
+                <w:sz w:val="24"/>
+                <w:szCs w:val="24"/>
+              </w:rPr>
+              <w:t>формате</w:t>
+            </w:r>
+            <w:proofErr w:type="spellEnd"/>
+            <w:r>
+              <w:rPr>
+                <w:rFonts w:ascii="Times New Roman" w:hAnsi="Times New Roman" w:cs="Times New Roman"/>
+                <w:color w:val="000000" w:themeColor="text1"/>
+                <w:sz w:val="24"/>
+                <w:szCs w:val="24"/>
+              </w:rPr>
+              <w:t xml:space="preserve"> YYYYMMDD</w:t>
             </w:r>
           </w:p>
         </w:tc>
       </w:tr>
       <w:tr>
-        <w:tblPrEx>
-          <w:tblCellMar>
-            <w:top w:w="0" w:type="dxa"/>
-            <w:bottom w:w="0" w:type="dxa"/>
-          </w:tblCellMar>
-        </w:tblPrEx>
         <w:tc>
           <w:tcPr>
             <w:tcW w:w="2600" w:type="dxa"/>
@@ -759,6 +893,7 @@
                 <w:szCs w:val="24"/>
               </w:rPr>
             </w:pPr>
+            <w:proofErr w:type="spellStart"/>
             <w:r>
               <w:rPr>
                 <w:rFonts w:ascii="Times New Roman" w:eastAsia="Consolas" w:hAnsi="Times New Roman" w:cs="Times New Roman"/>
@@ -768,6 +903,7 @@
               </w:rPr>
               <w:t>full_date</w:t>
             </w:r>
+            <w:proofErr w:type="spellEnd"/>
           </w:p>
         </w:tc>
         <w:tc>
@@ -809,25 +945,41 @@
                 <w:szCs w:val="24"/>
               </w:rPr>
             </w:pPr>
-            <w:r>
-              <w:rPr>
-                <w:rFonts w:ascii="Times New Roman" w:hAnsi="Times New Roman" w:cs="Times New Roman"/>
-                <w:color w:val="000000" w:themeColor="text1"/>
-                <w:sz w:val="24"/>
-                <w:szCs w:val="24"/>
-              </w:rPr>
-              <w:t>Календарная дата</w:t>
-            </w:r>
+            <w:proofErr w:type="spellStart"/>
+            <w:r>
+              <w:rPr>
+                <w:rFonts w:ascii="Times New Roman" w:hAnsi="Times New Roman" w:cs="Times New Roman"/>
+                <w:color w:val="000000" w:themeColor="text1"/>
+                <w:sz w:val="24"/>
+                <w:szCs w:val="24"/>
+              </w:rPr>
+              <w:t>Календарная</w:t>
+            </w:r>
+            <w:proofErr w:type="spellEnd"/>
+            <w:r>
+              <w:rPr>
+                <w:rFonts w:ascii="Times New Roman" w:hAnsi="Times New Roman" w:cs="Times New Roman"/>
+                <w:color w:val="000000" w:themeColor="text1"/>
+                <w:sz w:val="24"/>
+                <w:szCs w:val="24"/>
+              </w:rPr>
+              <w:t xml:space="preserve"> </w:t>
+            </w:r>
+            <w:proofErr w:type="spellStart"/>
+            <w:r>
+              <w:rPr>
+                <w:rFonts w:ascii="Times New Roman" w:hAnsi="Times New Roman" w:cs="Times New Roman"/>
+                <w:color w:val="000000" w:themeColor="text1"/>
+                <w:sz w:val="24"/>
+                <w:szCs w:val="24"/>
+              </w:rPr>
+              <w:t>дата</w:t>
+            </w:r>
+            <w:proofErr w:type="spellEnd"/>
           </w:p>
         </w:tc>
       </w:tr>
       <w:tr>
-        <w:tblPrEx>
-          <w:tblCellMar>
-            <w:top w:w="0" w:type="dxa"/>
-            <w:bottom w:w="0" w:type="dxa"/>
-          </w:tblCellMar>
-        </w:tblPrEx>
         <w:tc>
           <w:tcPr>
             <w:tcW w:w="2600" w:type="dxa"/>
@@ -892,25 +1044,41 @@
                 <w:szCs w:val="24"/>
               </w:rPr>
             </w:pPr>
-            <w:r>
-              <w:rPr>
-                <w:rFonts w:ascii="Times New Roman" w:hAnsi="Times New Roman" w:cs="Times New Roman"/>
-                <w:color w:val="000000" w:themeColor="text1"/>
-                <w:sz w:val="24"/>
-                <w:szCs w:val="24"/>
-              </w:rPr>
-              <w:t>Номер месяца</w:t>
-            </w:r>
+            <w:proofErr w:type="spellStart"/>
+            <w:r>
+              <w:rPr>
+                <w:rFonts w:ascii="Times New Roman" w:hAnsi="Times New Roman" w:cs="Times New Roman"/>
+                <w:color w:val="000000" w:themeColor="text1"/>
+                <w:sz w:val="24"/>
+                <w:szCs w:val="24"/>
+              </w:rPr>
+              <w:t>Номер</w:t>
+            </w:r>
+            <w:proofErr w:type="spellEnd"/>
+            <w:r>
+              <w:rPr>
+                <w:rFonts w:ascii="Times New Roman" w:hAnsi="Times New Roman" w:cs="Times New Roman"/>
+                <w:color w:val="000000" w:themeColor="text1"/>
+                <w:sz w:val="24"/>
+                <w:szCs w:val="24"/>
+              </w:rPr>
+              <w:t xml:space="preserve"> </w:t>
+            </w:r>
+            <w:proofErr w:type="spellStart"/>
+            <w:r>
+              <w:rPr>
+                <w:rFonts w:ascii="Times New Roman" w:hAnsi="Times New Roman" w:cs="Times New Roman"/>
+                <w:color w:val="000000" w:themeColor="text1"/>
+                <w:sz w:val="24"/>
+                <w:szCs w:val="24"/>
+              </w:rPr>
+              <w:t>месяца</w:t>
+            </w:r>
+            <w:proofErr w:type="spellEnd"/>
           </w:p>
         </w:tc>
       </w:tr>
       <w:tr>
-        <w:tblPrEx>
-          <w:tblCellMar>
-            <w:top w:w="0" w:type="dxa"/>
-            <w:bottom w:w="0" w:type="dxa"/>
-          </w:tblCellMar>
-        </w:tblPrEx>
         <w:tc>
           <w:tcPr>
             <w:tcW w:w="2600" w:type="dxa"/>
@@ -975,25 +1143,41 @@
                 <w:szCs w:val="24"/>
               </w:rPr>
             </w:pPr>
-            <w:r>
-              <w:rPr>
-                <w:rFonts w:ascii="Times New Roman" w:hAnsi="Times New Roman" w:cs="Times New Roman"/>
-                <w:color w:val="000000" w:themeColor="text1"/>
-                <w:sz w:val="24"/>
-                <w:szCs w:val="24"/>
-              </w:rPr>
-              <w:t>Номер квартала</w:t>
-            </w:r>
+            <w:proofErr w:type="spellStart"/>
+            <w:r>
+              <w:rPr>
+                <w:rFonts w:ascii="Times New Roman" w:hAnsi="Times New Roman" w:cs="Times New Roman"/>
+                <w:color w:val="000000" w:themeColor="text1"/>
+                <w:sz w:val="24"/>
+                <w:szCs w:val="24"/>
+              </w:rPr>
+              <w:t>Номер</w:t>
+            </w:r>
+            <w:proofErr w:type="spellEnd"/>
+            <w:r>
+              <w:rPr>
+                <w:rFonts w:ascii="Times New Roman" w:hAnsi="Times New Roman" w:cs="Times New Roman"/>
+                <w:color w:val="000000" w:themeColor="text1"/>
+                <w:sz w:val="24"/>
+                <w:szCs w:val="24"/>
+              </w:rPr>
+              <w:t xml:space="preserve"> </w:t>
+            </w:r>
+            <w:proofErr w:type="spellStart"/>
+            <w:r>
+              <w:rPr>
+                <w:rFonts w:ascii="Times New Roman" w:hAnsi="Times New Roman" w:cs="Times New Roman"/>
+                <w:color w:val="000000" w:themeColor="text1"/>
+                <w:sz w:val="24"/>
+                <w:szCs w:val="24"/>
+              </w:rPr>
+              <w:t>квартала</w:t>
+            </w:r>
+            <w:proofErr w:type="spellEnd"/>
           </w:p>
         </w:tc>
       </w:tr>
       <w:tr>
-        <w:tblPrEx>
-          <w:tblCellMar>
-            <w:top w:w="0" w:type="dxa"/>
-            <w:bottom w:w="0" w:type="dxa"/>
-          </w:tblCellMar>
-        </w:tblPrEx>
         <w:tc>
           <w:tcPr>
             <w:tcW w:w="2600" w:type="dxa"/>
@@ -1058,6 +1242,7 @@
                 <w:szCs w:val="24"/>
               </w:rPr>
             </w:pPr>
+            <w:proofErr w:type="spellStart"/>
             <w:r>
               <w:rPr>
                 <w:rFonts w:ascii="Times New Roman" w:hAnsi="Times New Roman" w:cs="Times New Roman"/>
@@ -1067,6 +1252,7 @@
               </w:rPr>
               <w:t>Год</w:t>
             </w:r>
+            <w:proofErr w:type="spellEnd"/>
           </w:p>
         </w:tc>
       </w:tr>
@@ -1081,6 +1267,7 @@
           <w:szCs w:val="24"/>
         </w:rPr>
       </w:pPr>
+      <w:proofErr w:type="spellStart"/>
       <w:r>
         <w:rPr>
           <w:rFonts w:ascii="Times New Roman" w:hAnsi="Times New Roman" w:cs="Times New Roman"/>
@@ -1090,6 +1277,7 @@
         </w:rPr>
         <w:t>Dim_Customer</w:t>
       </w:r>
+      <w:proofErr w:type="spellEnd"/>
     </w:p>
     <w:p>
       <w:pPr>
@@ -1180,12 +1368,6 @@
         <w:gridCol w:w="4200"/>
       </w:tblGrid>
       <w:tr>
-        <w:tblPrEx>
-          <w:tblCellMar>
-            <w:top w:w="0" w:type="dxa"/>
-            <w:bottom w:w="0" w:type="dxa"/>
-          </w:tblCellMar>
-        </w:tblPrEx>
         <w:trPr>
           <w:tblHeader/>
         </w:trPr>
@@ -1203,6 +1385,7 @@
                 <w:szCs w:val="24"/>
               </w:rPr>
             </w:pPr>
+            <w:proofErr w:type="spellStart"/>
             <w:r>
               <w:rPr>
                 <w:rFonts w:ascii="Times New Roman" w:hAnsi="Times New Roman" w:cs="Times New Roman"/>
@@ -1214,6 +1397,7 @@
               </w:rPr>
               <w:t>Атрибут</w:t>
             </w:r>
+            <w:proofErr w:type="spellEnd"/>
           </w:p>
         </w:tc>
         <w:tc>
@@ -1230,6 +1414,7 @@
                 <w:szCs w:val="24"/>
               </w:rPr>
             </w:pPr>
+            <w:proofErr w:type="spellStart"/>
             <w:r>
               <w:rPr>
                 <w:rFonts w:ascii="Times New Roman" w:hAnsi="Times New Roman" w:cs="Times New Roman"/>
@@ -1239,24 +1424,9 @@
                 <w:sz w:val="24"/>
                 <w:szCs w:val="24"/>
               </w:rPr>
-              <w:t>Тип / ключ</w:t>
-            </w:r>
-          </w:p>
-        </w:tc>
-        <w:tc>
-          <w:tcPr>
-            <w:tcW w:w="4200" w:type="dxa"/>
-            <w:shd w:val="clear" w:color="auto" w:fill="auto"/>
-          </w:tcPr>
-          <w:p>
-            <w:pPr>
-              <w:rPr>
-                <w:rFonts w:ascii="Times New Roman" w:hAnsi="Times New Roman" w:cs="Times New Roman"/>
-                <w:color w:val="000000" w:themeColor="text1"/>
-                <w:sz w:val="24"/>
-                <w:szCs w:val="24"/>
-              </w:rPr>
-            </w:pPr>
+              <w:t>Тип</w:t>
+            </w:r>
+            <w:proofErr w:type="spellEnd"/>
             <w:r>
               <w:rPr>
                 <w:rFonts w:ascii="Times New Roman" w:hAnsi="Times New Roman" w:cs="Times New Roman"/>
@@ -1266,18 +1436,54 @@
                 <w:sz w:val="24"/>
                 <w:szCs w:val="24"/>
               </w:rPr>
+              <w:t xml:space="preserve"> / </w:t>
+            </w:r>
+            <w:proofErr w:type="spellStart"/>
+            <w:r>
+              <w:rPr>
+                <w:rFonts w:ascii="Times New Roman" w:hAnsi="Times New Roman" w:cs="Times New Roman"/>
+                <w:b/>
+                <w:bCs/>
+                <w:color w:val="000000" w:themeColor="text1"/>
+                <w:sz w:val="24"/>
+                <w:szCs w:val="24"/>
+              </w:rPr>
+              <w:t>ключ</w:t>
+            </w:r>
+            <w:proofErr w:type="spellEnd"/>
+          </w:p>
+        </w:tc>
+        <w:tc>
+          <w:tcPr>
+            <w:tcW w:w="4200" w:type="dxa"/>
+            <w:shd w:val="clear" w:color="auto" w:fill="auto"/>
+          </w:tcPr>
+          <w:p>
+            <w:pPr>
+              <w:rPr>
+                <w:rFonts w:ascii="Times New Roman" w:hAnsi="Times New Roman" w:cs="Times New Roman"/>
+                <w:color w:val="000000" w:themeColor="text1"/>
+                <w:sz w:val="24"/>
+                <w:szCs w:val="24"/>
+              </w:rPr>
+            </w:pPr>
+            <w:proofErr w:type="spellStart"/>
+            <w:r>
+              <w:rPr>
+                <w:rFonts w:ascii="Times New Roman" w:hAnsi="Times New Roman" w:cs="Times New Roman"/>
+                <w:b/>
+                <w:bCs/>
+                <w:color w:val="000000" w:themeColor="text1"/>
+                <w:sz w:val="24"/>
+                <w:szCs w:val="24"/>
+              </w:rPr>
               <w:t>Описание</w:t>
             </w:r>
+            <w:proofErr w:type="spellEnd"/>
           </w:p>
         </w:tc>
       </w:tr>
       <w:tr>
-        <w:tblPrEx>
-          <w:tblCellMar>
-            <w:top w:w="0" w:type="dxa"/>
-            <w:bottom w:w="0" w:type="dxa"/>
-          </w:tblCellMar>
-        </w:tblPrEx>
         <w:tc>
           <w:tcPr>
             <w:tcW w:w="2600" w:type="dxa"/>
@@ -1292,6 +1498,7 @@
                 <w:szCs w:val="24"/>
               </w:rPr>
             </w:pPr>
+            <w:proofErr w:type="spellStart"/>
             <w:r>
               <w:rPr>
                 <w:rFonts w:ascii="Times New Roman" w:eastAsia="Consolas" w:hAnsi="Times New Roman" w:cs="Times New Roman"/>
@@ -1301,6 +1508,7 @@
               </w:rPr>
               <w:t>customer_key</w:t>
             </w:r>
+            <w:proofErr w:type="spellEnd"/>
           </w:p>
         </w:tc>
         <w:tc>
@@ -1342,25 +1550,41 @@
                 <w:szCs w:val="24"/>
               </w:rPr>
             </w:pPr>
-            <w:r>
-              <w:rPr>
-                <w:rFonts w:ascii="Times New Roman" w:hAnsi="Times New Roman" w:cs="Times New Roman"/>
-                <w:color w:val="000000" w:themeColor="text1"/>
-                <w:sz w:val="24"/>
-                <w:szCs w:val="24"/>
-              </w:rPr>
-              <w:t>Суррогатный ключ</w:t>
-            </w:r>
+            <w:proofErr w:type="spellStart"/>
+            <w:r>
+              <w:rPr>
+                <w:rFonts w:ascii="Times New Roman" w:hAnsi="Times New Roman" w:cs="Times New Roman"/>
+                <w:color w:val="000000" w:themeColor="text1"/>
+                <w:sz w:val="24"/>
+                <w:szCs w:val="24"/>
+              </w:rPr>
+              <w:t>Суррогатный</w:t>
+            </w:r>
+            <w:proofErr w:type="spellEnd"/>
+            <w:r>
+              <w:rPr>
+                <w:rFonts w:ascii="Times New Roman" w:hAnsi="Times New Roman" w:cs="Times New Roman"/>
+                <w:color w:val="000000" w:themeColor="text1"/>
+                <w:sz w:val="24"/>
+                <w:szCs w:val="24"/>
+              </w:rPr>
+              <w:t xml:space="preserve"> </w:t>
+            </w:r>
+            <w:proofErr w:type="spellStart"/>
+            <w:r>
+              <w:rPr>
+                <w:rFonts w:ascii="Times New Roman" w:hAnsi="Times New Roman" w:cs="Times New Roman"/>
+                <w:color w:val="000000" w:themeColor="text1"/>
+                <w:sz w:val="24"/>
+                <w:szCs w:val="24"/>
+              </w:rPr>
+              <w:t>ключ</w:t>
+            </w:r>
+            <w:proofErr w:type="spellEnd"/>
           </w:p>
         </w:tc>
       </w:tr>
       <w:tr>
-        <w:tblPrEx>
-          <w:tblCellMar>
-            <w:top w:w="0" w:type="dxa"/>
-            <w:bottom w:w="0" w:type="dxa"/>
-          </w:tblCellMar>
-        </w:tblPrEx>
         <w:tc>
           <w:tcPr>
             <w:tcW w:w="2600" w:type="dxa"/>
@@ -1375,6 +1599,7 @@
                 <w:szCs w:val="24"/>
               </w:rPr>
             </w:pPr>
+            <w:proofErr w:type="spellStart"/>
             <w:r>
               <w:rPr>
                 <w:rFonts w:ascii="Times New Roman" w:eastAsia="Consolas" w:hAnsi="Times New Roman" w:cs="Times New Roman"/>
@@ -1384,6 +1609,7 @@
               </w:rPr>
               <w:t>customer_id</w:t>
             </w:r>
+            <w:proofErr w:type="spellEnd"/>
           </w:p>
         </w:tc>
         <w:tc>
@@ -1425,25 +1651,70 @@
                 <w:szCs w:val="24"/>
               </w:rPr>
             </w:pPr>
-            <w:r>
-              <w:rPr>
-                <w:rFonts w:ascii="Times New Roman" w:hAnsi="Times New Roman" w:cs="Times New Roman"/>
-                <w:color w:val="000000" w:themeColor="text1"/>
-                <w:sz w:val="24"/>
-                <w:szCs w:val="24"/>
-              </w:rPr>
-              <w:t>Ключ покупателя из OLTP</w:t>
+            <w:proofErr w:type="spellStart"/>
+            <w:r>
+              <w:rPr>
+                <w:rFonts w:ascii="Times New Roman" w:hAnsi="Times New Roman" w:cs="Times New Roman"/>
+                <w:color w:val="000000" w:themeColor="text1"/>
+                <w:sz w:val="24"/>
+                <w:szCs w:val="24"/>
+              </w:rPr>
+              <w:t>Ключ</w:t>
+            </w:r>
+            <w:proofErr w:type="spellEnd"/>
+            <w:r>
+              <w:rPr>
+                <w:rFonts w:ascii="Times New Roman" w:hAnsi="Times New Roman" w:cs="Times New Roman"/>
+                <w:color w:val="000000" w:themeColor="text1"/>
+                <w:sz w:val="24"/>
+                <w:szCs w:val="24"/>
+              </w:rPr>
+              <w:t xml:space="preserve"> </w:t>
+            </w:r>
+            <w:proofErr w:type="spellStart"/>
+            <w:r>
+              <w:rPr>
+                <w:rFonts w:ascii="Times New Roman" w:hAnsi="Times New Roman" w:cs="Times New Roman"/>
+                <w:color w:val="000000" w:themeColor="text1"/>
+                <w:sz w:val="24"/>
+                <w:szCs w:val="24"/>
+              </w:rPr>
+              <w:t>покупателя</w:t>
+            </w:r>
+            <w:proofErr w:type="spellEnd"/>
+            <w:r>
+              <w:rPr>
+                <w:rFonts w:ascii="Times New Roman" w:hAnsi="Times New Roman" w:cs="Times New Roman"/>
+                <w:color w:val="000000" w:themeColor="text1"/>
+                <w:sz w:val="24"/>
+                <w:szCs w:val="24"/>
+              </w:rPr>
+              <w:t xml:space="preserve"> </w:t>
+            </w:r>
+            <w:proofErr w:type="spellStart"/>
+            <w:r>
+              <w:rPr>
+                <w:rFonts w:ascii="Times New Roman" w:hAnsi="Times New Roman" w:cs="Times New Roman"/>
+                <w:color w:val="000000" w:themeColor="text1"/>
+                <w:sz w:val="24"/>
+                <w:szCs w:val="24"/>
+              </w:rPr>
+              <w:t>из</w:t>
+            </w:r>
+            <w:proofErr w:type="spellEnd"/>
+            <w:r>
+              <w:rPr>
+                <w:rFonts w:ascii="Times New Roman" w:hAnsi="Times New Roman" w:cs="Times New Roman"/>
+                <w:color w:val="000000" w:themeColor="text1"/>
+                <w:sz w:val="24"/>
+                <w:szCs w:val="24"/>
+              </w:rPr>
+              <w:t xml:space="preserve"> OLTP</w:t>
             </w:r>
           </w:p>
         </w:tc>
       </w:tr>
       <w:tr>
-        <w:tblPrEx>
-          <w:tblCellMar>
-            <w:top w:w="0" w:type="dxa"/>
-            <w:bottom w:w="0" w:type="dxa"/>
-          </w:tblCellMar>
-        </w:tblPrEx>
         <w:tc>
           <w:tcPr>
             <w:tcW w:w="2600" w:type="dxa"/>
@@ -1458,6 +1729,7 @@
                 <w:szCs w:val="24"/>
               </w:rPr>
             </w:pPr>
+            <w:proofErr w:type="spellStart"/>
             <w:r>
               <w:rPr>
                 <w:rFonts w:ascii="Times New Roman" w:eastAsia="Consolas" w:hAnsi="Times New Roman" w:cs="Times New Roman"/>
@@ -1467,6 +1739,7 @@
               </w:rPr>
               <w:t>full_name</w:t>
             </w:r>
+            <w:proofErr w:type="spellEnd"/>
           </w:p>
         </w:tc>
         <w:tc>
@@ -1508,25 +1781,41 @@
                 <w:szCs w:val="24"/>
               </w:rPr>
             </w:pPr>
-            <w:r>
-              <w:rPr>
-                <w:rFonts w:ascii="Times New Roman" w:hAnsi="Times New Roman" w:cs="Times New Roman"/>
-                <w:color w:val="000000" w:themeColor="text1"/>
-                <w:sz w:val="24"/>
-                <w:szCs w:val="24"/>
-              </w:rPr>
-              <w:t>Имя и фамилия</w:t>
-            </w:r>
+            <w:proofErr w:type="spellStart"/>
+            <w:r>
+              <w:rPr>
+                <w:rFonts w:ascii="Times New Roman" w:hAnsi="Times New Roman" w:cs="Times New Roman"/>
+                <w:color w:val="000000" w:themeColor="text1"/>
+                <w:sz w:val="24"/>
+                <w:szCs w:val="24"/>
+              </w:rPr>
+              <w:t>Имя</w:t>
+            </w:r>
+            <w:proofErr w:type="spellEnd"/>
+            <w:r>
+              <w:rPr>
+                <w:rFonts w:ascii="Times New Roman" w:hAnsi="Times New Roman" w:cs="Times New Roman"/>
+                <w:color w:val="000000" w:themeColor="text1"/>
+                <w:sz w:val="24"/>
+                <w:szCs w:val="24"/>
+              </w:rPr>
+              <w:t xml:space="preserve"> и </w:t>
+            </w:r>
+            <w:proofErr w:type="spellStart"/>
+            <w:r>
+              <w:rPr>
+                <w:rFonts w:ascii="Times New Roman" w:hAnsi="Times New Roman" w:cs="Times New Roman"/>
+                <w:color w:val="000000" w:themeColor="text1"/>
+                <w:sz w:val="24"/>
+                <w:szCs w:val="24"/>
+              </w:rPr>
+              <w:t>фамилия</w:t>
+            </w:r>
+            <w:proofErr w:type="spellEnd"/>
           </w:p>
         </w:tc>
       </w:tr>
       <w:tr>
-        <w:tblPrEx>
-          <w:tblCellMar>
-            <w:top w:w="0" w:type="dxa"/>
-            <w:bottom w:w="0" w:type="dxa"/>
-          </w:tblCellMar>
-        </w:tblPrEx>
         <w:tc>
           <w:tcPr>
             <w:tcW w:w="2600" w:type="dxa"/>
@@ -1614,6 +1903,7 @@
           <w:szCs w:val="24"/>
         </w:rPr>
       </w:pPr>
+      <w:proofErr w:type="spellStart"/>
       <w:r>
         <w:rPr>
           <w:rFonts w:ascii="Times New Roman" w:hAnsi="Times New Roman" w:cs="Times New Roman"/>
@@ -1623,6 +1913,7 @@
         </w:rPr>
         <w:t>Dim_Product</w:t>
       </w:r>
+      <w:proofErr w:type="spellEnd"/>
     </w:p>
     <w:p>
       <w:pPr>
@@ -1713,12 +2004,6 @@
         <w:gridCol w:w="4200"/>
       </w:tblGrid>
       <w:tr>
-        <w:tblPrEx>
-          <w:tblCellMar>
-            <w:top w:w="0" w:type="dxa"/>
-            <w:bottom w:w="0" w:type="dxa"/>
-          </w:tblCellMar>
-        </w:tblPrEx>
         <w:trPr>
           <w:tblHeader/>
         </w:trPr>
@@ -1736,6 +2021,7 @@
                 <w:szCs w:val="24"/>
               </w:rPr>
             </w:pPr>
+            <w:proofErr w:type="spellStart"/>
             <w:r>
               <w:rPr>
                 <w:rFonts w:ascii="Times New Roman" w:hAnsi="Times New Roman" w:cs="Times New Roman"/>
@@ -1747,6 +2033,7 @@
               </w:rPr>
               <w:t>Атрибут</w:t>
             </w:r>
+            <w:proofErr w:type="spellEnd"/>
           </w:p>
         </w:tc>
         <w:tc>
@@ -1763,6 +2050,7 @@
                 <w:szCs w:val="24"/>
               </w:rPr>
             </w:pPr>
+            <w:proofErr w:type="spellStart"/>
             <w:r>
               <w:rPr>
                 <w:rFonts w:ascii="Times New Roman" w:hAnsi="Times New Roman" w:cs="Times New Roman"/>
@@ -1772,24 +2060,9 @@
                 <w:sz w:val="24"/>
                 <w:szCs w:val="24"/>
               </w:rPr>
-              <w:t>Тип / ключ</w:t>
-            </w:r>
-          </w:p>
-        </w:tc>
-        <w:tc>
-          <w:tcPr>
-            <w:tcW w:w="4200" w:type="dxa"/>
-            <w:shd w:val="clear" w:color="auto" w:fill="auto"/>
-          </w:tcPr>
-          <w:p>
-            <w:pPr>
-              <w:rPr>
-                <w:rFonts w:ascii="Times New Roman" w:hAnsi="Times New Roman" w:cs="Times New Roman"/>
-                <w:color w:val="000000" w:themeColor="text1"/>
-                <w:sz w:val="24"/>
-                <w:szCs w:val="24"/>
-              </w:rPr>
-            </w:pPr>
+              <w:t>Тип</w:t>
+            </w:r>
+            <w:proofErr w:type="spellEnd"/>
             <w:r>
               <w:rPr>
                 <w:rFonts w:ascii="Times New Roman" w:hAnsi="Times New Roman" w:cs="Times New Roman"/>
@@ -1799,18 +2072,54 @@
                 <w:sz w:val="24"/>
                 <w:szCs w:val="24"/>
               </w:rPr>
+              <w:t xml:space="preserve"> / </w:t>
+            </w:r>
+            <w:proofErr w:type="spellStart"/>
+            <w:r>
+              <w:rPr>
+                <w:rFonts w:ascii="Times New Roman" w:hAnsi="Times New Roman" w:cs="Times New Roman"/>
+                <w:b/>
+                <w:bCs/>
+                <w:color w:val="000000" w:themeColor="text1"/>
+                <w:sz w:val="24"/>
+                <w:szCs w:val="24"/>
+              </w:rPr>
+              <w:t>ключ</w:t>
+            </w:r>
+            <w:proofErr w:type="spellEnd"/>
+          </w:p>
+        </w:tc>
+        <w:tc>
+          <w:tcPr>
+            <w:tcW w:w="4200" w:type="dxa"/>
+            <w:shd w:val="clear" w:color="auto" w:fill="auto"/>
+          </w:tcPr>
+          <w:p>
+            <w:pPr>
+              <w:rPr>
+                <w:rFonts w:ascii="Times New Roman" w:hAnsi="Times New Roman" w:cs="Times New Roman"/>
+                <w:color w:val="000000" w:themeColor="text1"/>
+                <w:sz w:val="24"/>
+                <w:szCs w:val="24"/>
+              </w:rPr>
+            </w:pPr>
+            <w:proofErr w:type="spellStart"/>
+            <w:r>
+              <w:rPr>
+                <w:rFonts w:ascii="Times New Roman" w:hAnsi="Times New Roman" w:cs="Times New Roman"/>
+                <w:b/>
+                <w:bCs/>
+                <w:color w:val="000000" w:themeColor="text1"/>
+                <w:sz w:val="24"/>
+                <w:szCs w:val="24"/>
+              </w:rPr>
               <w:t>Описание</w:t>
             </w:r>
+            <w:proofErr w:type="spellEnd"/>
           </w:p>
         </w:tc>
       </w:tr>
       <w:tr>
-        <w:tblPrEx>
-          <w:tblCellMar>
-            <w:top w:w="0" w:type="dxa"/>
-            <w:bottom w:w="0" w:type="dxa"/>
-          </w:tblCellMar>
-        </w:tblPrEx>
         <w:tc>
           <w:tcPr>
             <w:tcW w:w="2600" w:type="dxa"/>
@@ -1825,6 +2134,7 @@
                 <w:szCs w:val="24"/>
               </w:rPr>
             </w:pPr>
+            <w:proofErr w:type="spellStart"/>
             <w:r>
               <w:rPr>
                 <w:rFonts w:ascii="Times New Roman" w:eastAsia="Consolas" w:hAnsi="Times New Roman" w:cs="Times New Roman"/>
@@ -1834,6 +2144,7 @@
               </w:rPr>
               <w:t>product_key</w:t>
             </w:r>
+            <w:proofErr w:type="spellEnd"/>
           </w:p>
         </w:tc>
         <w:tc>
@@ -1875,25 +2186,41 @@
                 <w:szCs w:val="24"/>
               </w:rPr>
             </w:pPr>
-            <w:r>
-              <w:rPr>
-                <w:rFonts w:ascii="Times New Roman" w:hAnsi="Times New Roman" w:cs="Times New Roman"/>
-                <w:color w:val="000000" w:themeColor="text1"/>
-                <w:sz w:val="24"/>
-                <w:szCs w:val="24"/>
-              </w:rPr>
-              <w:t>Суррогатный ключ</w:t>
-            </w:r>
+            <w:proofErr w:type="spellStart"/>
+            <w:r>
+              <w:rPr>
+                <w:rFonts w:ascii="Times New Roman" w:hAnsi="Times New Roman" w:cs="Times New Roman"/>
+                <w:color w:val="000000" w:themeColor="text1"/>
+                <w:sz w:val="24"/>
+                <w:szCs w:val="24"/>
+              </w:rPr>
+              <w:t>Суррогатный</w:t>
+            </w:r>
+            <w:proofErr w:type="spellEnd"/>
+            <w:r>
+              <w:rPr>
+                <w:rFonts w:ascii="Times New Roman" w:hAnsi="Times New Roman" w:cs="Times New Roman"/>
+                <w:color w:val="000000" w:themeColor="text1"/>
+                <w:sz w:val="24"/>
+                <w:szCs w:val="24"/>
+              </w:rPr>
+              <w:t xml:space="preserve"> </w:t>
+            </w:r>
+            <w:proofErr w:type="spellStart"/>
+            <w:r>
+              <w:rPr>
+                <w:rFonts w:ascii="Times New Roman" w:hAnsi="Times New Roman" w:cs="Times New Roman"/>
+                <w:color w:val="000000" w:themeColor="text1"/>
+                <w:sz w:val="24"/>
+                <w:szCs w:val="24"/>
+              </w:rPr>
+              <w:t>ключ</w:t>
+            </w:r>
+            <w:proofErr w:type="spellEnd"/>
           </w:p>
         </w:tc>
       </w:tr>
       <w:tr>
-        <w:tblPrEx>
-          <w:tblCellMar>
-            <w:top w:w="0" w:type="dxa"/>
-            <w:bottom w:w="0" w:type="dxa"/>
-          </w:tblCellMar>
-        </w:tblPrEx>
         <w:tc>
           <w:tcPr>
             <w:tcW w:w="2600" w:type="dxa"/>
@@ -1908,6 +2235,7 @@
                 <w:szCs w:val="24"/>
               </w:rPr>
             </w:pPr>
+            <w:proofErr w:type="spellStart"/>
             <w:r>
               <w:rPr>
                 <w:rFonts w:ascii="Times New Roman" w:eastAsia="Consolas" w:hAnsi="Times New Roman" w:cs="Times New Roman"/>
@@ -1918,6 +2246,7 @@
               <w:lastRenderedPageBreak/>
               <w:t>product_id</w:t>
             </w:r>
+            <w:proofErr w:type="spellEnd"/>
           </w:p>
         </w:tc>
         <w:tc>
@@ -1959,25 +2288,70 @@
                 <w:szCs w:val="24"/>
               </w:rPr>
             </w:pPr>
-            <w:r>
-              <w:rPr>
-                <w:rFonts w:ascii="Times New Roman" w:hAnsi="Times New Roman" w:cs="Times New Roman"/>
-                <w:color w:val="000000" w:themeColor="text1"/>
-                <w:sz w:val="24"/>
-                <w:szCs w:val="24"/>
-              </w:rPr>
-              <w:t>Ключ товара из OLTP</w:t>
+            <w:proofErr w:type="spellStart"/>
+            <w:r>
+              <w:rPr>
+                <w:rFonts w:ascii="Times New Roman" w:hAnsi="Times New Roman" w:cs="Times New Roman"/>
+                <w:color w:val="000000" w:themeColor="text1"/>
+                <w:sz w:val="24"/>
+                <w:szCs w:val="24"/>
+              </w:rPr>
+              <w:t>Ключ</w:t>
+            </w:r>
+            <w:proofErr w:type="spellEnd"/>
+            <w:r>
+              <w:rPr>
+                <w:rFonts w:ascii="Times New Roman" w:hAnsi="Times New Roman" w:cs="Times New Roman"/>
+                <w:color w:val="000000" w:themeColor="text1"/>
+                <w:sz w:val="24"/>
+                <w:szCs w:val="24"/>
+              </w:rPr>
+              <w:t xml:space="preserve"> </w:t>
+            </w:r>
+            <w:proofErr w:type="spellStart"/>
+            <w:r>
+              <w:rPr>
+                <w:rFonts w:ascii="Times New Roman" w:hAnsi="Times New Roman" w:cs="Times New Roman"/>
+                <w:color w:val="000000" w:themeColor="text1"/>
+                <w:sz w:val="24"/>
+                <w:szCs w:val="24"/>
+              </w:rPr>
+              <w:t>товара</w:t>
+            </w:r>
+            <w:proofErr w:type="spellEnd"/>
+            <w:r>
+              <w:rPr>
+                <w:rFonts w:ascii="Times New Roman" w:hAnsi="Times New Roman" w:cs="Times New Roman"/>
+                <w:color w:val="000000" w:themeColor="text1"/>
+                <w:sz w:val="24"/>
+                <w:szCs w:val="24"/>
+              </w:rPr>
+              <w:t xml:space="preserve"> </w:t>
+            </w:r>
+            <w:proofErr w:type="spellStart"/>
+            <w:r>
+              <w:rPr>
+                <w:rFonts w:ascii="Times New Roman" w:hAnsi="Times New Roman" w:cs="Times New Roman"/>
+                <w:color w:val="000000" w:themeColor="text1"/>
+                <w:sz w:val="24"/>
+                <w:szCs w:val="24"/>
+              </w:rPr>
+              <w:t>из</w:t>
+            </w:r>
+            <w:proofErr w:type="spellEnd"/>
+            <w:r>
+              <w:rPr>
+                <w:rFonts w:ascii="Times New Roman" w:hAnsi="Times New Roman" w:cs="Times New Roman"/>
+                <w:color w:val="000000" w:themeColor="text1"/>
+                <w:sz w:val="24"/>
+                <w:szCs w:val="24"/>
+              </w:rPr>
+              <w:t xml:space="preserve"> OLTP</w:t>
             </w:r>
           </w:p>
         </w:tc>
       </w:tr>
       <w:tr>
-        <w:tblPrEx>
-          <w:tblCellMar>
-            <w:top w:w="0" w:type="dxa"/>
-            <w:bottom w:w="0" w:type="dxa"/>
-          </w:tblCellMar>
-        </w:tblPrEx>
         <w:tc>
           <w:tcPr>
             <w:tcW w:w="2600" w:type="dxa"/>
@@ -1992,6 +2366,7 @@
                 <w:szCs w:val="24"/>
               </w:rPr>
             </w:pPr>
+            <w:proofErr w:type="spellStart"/>
             <w:r>
               <w:rPr>
                 <w:rFonts w:ascii="Times New Roman" w:eastAsia="Consolas" w:hAnsi="Times New Roman" w:cs="Times New Roman"/>
@@ -2001,6 +2376,7 @@
               </w:rPr>
               <w:t>product_name</w:t>
             </w:r>
+            <w:proofErr w:type="spellEnd"/>
           </w:p>
         </w:tc>
         <w:tc>
@@ -2042,25 +2418,41 @@
                 <w:szCs w:val="24"/>
               </w:rPr>
             </w:pPr>
-            <w:r>
-              <w:rPr>
-                <w:rFonts w:ascii="Times New Roman" w:hAnsi="Times New Roman" w:cs="Times New Roman"/>
-                <w:color w:val="000000" w:themeColor="text1"/>
-                <w:sz w:val="24"/>
-                <w:szCs w:val="24"/>
-              </w:rPr>
-              <w:t>Название товара</w:t>
-            </w:r>
+            <w:proofErr w:type="spellStart"/>
+            <w:r>
+              <w:rPr>
+                <w:rFonts w:ascii="Times New Roman" w:hAnsi="Times New Roman" w:cs="Times New Roman"/>
+                <w:color w:val="000000" w:themeColor="text1"/>
+                <w:sz w:val="24"/>
+                <w:szCs w:val="24"/>
+              </w:rPr>
+              <w:t>Название</w:t>
+            </w:r>
+            <w:proofErr w:type="spellEnd"/>
+            <w:r>
+              <w:rPr>
+                <w:rFonts w:ascii="Times New Roman" w:hAnsi="Times New Roman" w:cs="Times New Roman"/>
+                <w:color w:val="000000" w:themeColor="text1"/>
+                <w:sz w:val="24"/>
+                <w:szCs w:val="24"/>
+              </w:rPr>
+              <w:t xml:space="preserve"> </w:t>
+            </w:r>
+            <w:proofErr w:type="spellStart"/>
+            <w:r>
+              <w:rPr>
+                <w:rFonts w:ascii="Times New Roman" w:hAnsi="Times New Roman" w:cs="Times New Roman"/>
+                <w:color w:val="000000" w:themeColor="text1"/>
+                <w:sz w:val="24"/>
+                <w:szCs w:val="24"/>
+              </w:rPr>
+              <w:t>товара</w:t>
+            </w:r>
+            <w:proofErr w:type="spellEnd"/>
           </w:p>
         </w:tc>
       </w:tr>
       <w:tr>
-        <w:tblPrEx>
-          <w:tblCellMar>
-            <w:top w:w="0" w:type="dxa"/>
-            <w:bottom w:w="0" w:type="dxa"/>
-          </w:tblCellMar>
-        </w:tblPrEx>
         <w:tc>
           <w:tcPr>
             <w:tcW w:w="2600" w:type="dxa"/>
@@ -2075,6 +2467,7 @@
                 <w:szCs w:val="24"/>
               </w:rPr>
             </w:pPr>
+            <w:proofErr w:type="spellStart"/>
             <w:r>
               <w:rPr>
                 <w:rFonts w:ascii="Times New Roman" w:eastAsia="Consolas" w:hAnsi="Times New Roman" w:cs="Times New Roman"/>
@@ -2084,6 +2477,7 @@
               </w:rPr>
               <w:t>category_name</w:t>
             </w:r>
+            <w:proofErr w:type="spellEnd"/>
           </w:p>
         </w:tc>
         <w:tc>
@@ -2125,25 +2519,41 @@
                 <w:szCs w:val="24"/>
               </w:rPr>
             </w:pPr>
-            <w:r>
-              <w:rPr>
-                <w:rFonts w:ascii="Times New Roman" w:hAnsi="Times New Roman" w:cs="Times New Roman"/>
-                <w:color w:val="000000" w:themeColor="text1"/>
-                <w:sz w:val="24"/>
-                <w:szCs w:val="24"/>
-              </w:rPr>
-              <w:t>Категория товара</w:t>
-            </w:r>
+            <w:proofErr w:type="spellStart"/>
+            <w:r>
+              <w:rPr>
+                <w:rFonts w:ascii="Times New Roman" w:hAnsi="Times New Roman" w:cs="Times New Roman"/>
+                <w:color w:val="000000" w:themeColor="text1"/>
+                <w:sz w:val="24"/>
+                <w:szCs w:val="24"/>
+              </w:rPr>
+              <w:t>Категория</w:t>
+            </w:r>
+            <w:proofErr w:type="spellEnd"/>
+            <w:r>
+              <w:rPr>
+                <w:rFonts w:ascii="Times New Roman" w:hAnsi="Times New Roman" w:cs="Times New Roman"/>
+                <w:color w:val="000000" w:themeColor="text1"/>
+                <w:sz w:val="24"/>
+                <w:szCs w:val="24"/>
+              </w:rPr>
+              <w:t xml:space="preserve"> </w:t>
+            </w:r>
+            <w:proofErr w:type="spellStart"/>
+            <w:r>
+              <w:rPr>
+                <w:rFonts w:ascii="Times New Roman" w:hAnsi="Times New Roman" w:cs="Times New Roman"/>
+                <w:color w:val="000000" w:themeColor="text1"/>
+                <w:sz w:val="24"/>
+                <w:szCs w:val="24"/>
+              </w:rPr>
+              <w:t>товара</w:t>
+            </w:r>
+            <w:proofErr w:type="spellEnd"/>
           </w:p>
         </w:tc>
       </w:tr>
       <w:tr>
-        <w:tblPrEx>
-          <w:tblCellMar>
-            <w:top w:w="0" w:type="dxa"/>
-            <w:bottom w:w="0" w:type="dxa"/>
-          </w:tblCellMar>
-        </w:tblPrEx>
         <w:tc>
           <w:tcPr>
             <w:tcW w:w="2600" w:type="dxa"/>
@@ -2158,6 +2568,7 @@
                 <w:szCs w:val="24"/>
               </w:rPr>
             </w:pPr>
+            <w:proofErr w:type="spellStart"/>
             <w:r>
               <w:rPr>
                 <w:rFonts w:ascii="Times New Roman" w:eastAsia="Consolas" w:hAnsi="Times New Roman" w:cs="Times New Roman"/>
@@ -2165,8 +2576,18 @@
                 <w:sz w:val="24"/>
                 <w:szCs w:val="24"/>
               </w:rPr>
+              <w:t>Current_</w:t>
+            </w:r>
+            <w:r>
+              <w:rPr>
+                <w:rFonts w:ascii="Times New Roman" w:eastAsia="Consolas" w:hAnsi="Times New Roman" w:cs="Times New Roman"/>
+                <w:color w:val="000000" w:themeColor="text1"/>
+                <w:sz w:val="24"/>
+                <w:szCs w:val="24"/>
+              </w:rPr>
               <w:t>price</w:t>
             </w:r>
+            <w:proofErr w:type="spellEnd"/>
           </w:p>
         </w:tc>
         <w:tc>
@@ -2214,9 +2635,41 @@
                 <w:color w:val="000000" w:themeColor="text1"/>
                 <w:sz w:val="24"/>
                 <w:szCs w:val="24"/>
-              </w:rPr>
-              <w:t>Цена товара</w:t>
-            </w:r>
+                <w:lang w:val="ru-RU"/>
+              </w:rPr>
+              <w:t>Текущая ц</w:t>
+            </w:r>
+            <w:proofErr w:type="spellStart"/>
+            <w:r>
+              <w:rPr>
+                <w:rFonts w:ascii="Times New Roman" w:hAnsi="Times New Roman" w:cs="Times New Roman"/>
+                <w:color w:val="000000" w:themeColor="text1"/>
+                <w:sz w:val="24"/>
+                <w:szCs w:val="24"/>
+              </w:rPr>
+              <w:t>ена</w:t>
+            </w:r>
+            <w:proofErr w:type="spellEnd"/>
+            <w:r>
+              <w:rPr>
+                <w:rFonts w:ascii="Times New Roman" w:hAnsi="Times New Roman" w:cs="Times New Roman"/>
+                <w:color w:val="000000" w:themeColor="text1"/>
+                <w:sz w:val="24"/>
+                <w:szCs w:val="24"/>
+              </w:rPr>
+              <w:t xml:space="preserve"> </w:t>
+            </w:r>
+            <w:proofErr w:type="spellStart"/>
+            <w:r>
+              <w:rPr>
+                <w:rFonts w:ascii="Times New Roman" w:hAnsi="Times New Roman" w:cs="Times New Roman"/>
+                <w:color w:val="000000" w:themeColor="text1"/>
+                <w:sz w:val="24"/>
+                <w:szCs w:val="24"/>
+              </w:rPr>
+              <w:t>товара</w:t>
+            </w:r>
+            <w:proofErr w:type="spellEnd"/>
           </w:p>
         </w:tc>
       </w:tr>
@@ -2238,8 +2691,39 @@
           <w:sz w:val="24"/>
           <w:szCs w:val="24"/>
         </w:rPr>
-        <w:t>Part 3. Таблица фактов</w:t>
-      </w:r>
+        <w:t xml:space="preserve">Part 3. </w:t>
+      </w:r>
+      <w:proofErr w:type="spellStart"/>
+      <w:r>
+        <w:rPr>
+          <w:rFonts w:ascii="Times New Roman" w:hAnsi="Times New Roman" w:cs="Times New Roman"/>
+          <w:color w:val="000000" w:themeColor="text1"/>
+          <w:sz w:val="24"/>
+          <w:szCs w:val="24"/>
+        </w:rPr>
+        <w:t>Таблица</w:t>
+      </w:r>
+      <w:proofErr w:type="spellEnd"/>
+      <w:r>
+        <w:rPr>
+          <w:rFonts w:ascii="Times New Roman" w:hAnsi="Times New Roman" w:cs="Times New Roman"/>
+          <w:color w:val="000000" w:themeColor="text1"/>
+          <w:sz w:val="24"/>
+          <w:szCs w:val="24"/>
+        </w:rPr>
+        <w:t xml:space="preserve"> </w:t>
+      </w:r>
+      <w:proofErr w:type="spellStart"/>
+      <w:r>
+        <w:rPr>
+          <w:rFonts w:ascii="Times New Roman" w:hAnsi="Times New Roman" w:cs="Times New Roman"/>
+          <w:color w:val="000000" w:themeColor="text1"/>
+          <w:sz w:val="24"/>
+          <w:szCs w:val="24"/>
+        </w:rPr>
+        <w:t>фактов</w:t>
+      </w:r>
+      <w:proofErr w:type="spellEnd"/>
     </w:p>
     <w:p>
       <w:pPr>
@@ -2314,12 +2798,6 @@
         <w:gridCol w:w="4200"/>
       </w:tblGrid>
       <w:tr>
-        <w:tblPrEx>
-          <w:tblCellMar>
-            <w:top w:w="0" w:type="dxa"/>
-            <w:bottom w:w="0" w:type="dxa"/>
-          </w:tblCellMar>
-        </w:tblPrEx>
         <w:trPr>
           <w:tblHeader/>
         </w:trPr>
@@ -2337,6 +2815,7 @@
                 <w:szCs w:val="24"/>
               </w:rPr>
             </w:pPr>
+            <w:proofErr w:type="spellStart"/>
             <w:r>
               <w:rPr>
                 <w:rFonts w:ascii="Times New Roman" w:hAnsi="Times New Roman" w:cs="Times New Roman"/>
@@ -2348,6 +2827,7 @@
               </w:rPr>
               <w:t>Атрибут</w:t>
             </w:r>
+            <w:proofErr w:type="spellEnd"/>
           </w:p>
         </w:tc>
         <w:tc>
@@ -2364,6 +2844,7 @@
                 <w:szCs w:val="24"/>
               </w:rPr>
             </w:pPr>
+            <w:proofErr w:type="spellStart"/>
             <w:r>
               <w:rPr>
                 <w:rFonts w:ascii="Times New Roman" w:hAnsi="Times New Roman" w:cs="Times New Roman"/>
@@ -2373,24 +2854,9 @@
                 <w:sz w:val="24"/>
                 <w:szCs w:val="24"/>
               </w:rPr>
-              <w:t>Тип / ключ</w:t>
-            </w:r>
-          </w:p>
-        </w:tc>
-        <w:tc>
-          <w:tcPr>
-            <w:tcW w:w="4200" w:type="dxa"/>
-            <w:shd w:val="clear" w:color="auto" w:fill="auto"/>
-          </w:tcPr>
-          <w:p>
-            <w:pPr>
-              <w:rPr>
-                <w:rFonts w:ascii="Times New Roman" w:hAnsi="Times New Roman" w:cs="Times New Roman"/>
-                <w:color w:val="000000" w:themeColor="text1"/>
-                <w:sz w:val="24"/>
-                <w:szCs w:val="24"/>
-              </w:rPr>
-            </w:pPr>
+              <w:t>Тип</w:t>
+            </w:r>
+            <w:proofErr w:type="spellEnd"/>
             <w:r>
               <w:rPr>
                 <w:rFonts w:ascii="Times New Roman" w:hAnsi="Times New Roman" w:cs="Times New Roman"/>
@@ -2400,18 +2866,54 @@
                 <w:sz w:val="24"/>
                 <w:szCs w:val="24"/>
               </w:rPr>
+              <w:t xml:space="preserve"> / </w:t>
+            </w:r>
+            <w:proofErr w:type="spellStart"/>
+            <w:r>
+              <w:rPr>
+                <w:rFonts w:ascii="Times New Roman" w:hAnsi="Times New Roman" w:cs="Times New Roman"/>
+                <w:b/>
+                <w:bCs/>
+                <w:color w:val="000000" w:themeColor="text1"/>
+                <w:sz w:val="24"/>
+                <w:szCs w:val="24"/>
+              </w:rPr>
+              <w:t>ключ</w:t>
+            </w:r>
+            <w:proofErr w:type="spellEnd"/>
+          </w:p>
+        </w:tc>
+        <w:tc>
+          <w:tcPr>
+            <w:tcW w:w="4200" w:type="dxa"/>
+            <w:shd w:val="clear" w:color="auto" w:fill="auto"/>
+          </w:tcPr>
+          <w:p>
+            <w:pPr>
+              <w:rPr>
+                <w:rFonts w:ascii="Times New Roman" w:hAnsi="Times New Roman" w:cs="Times New Roman"/>
+                <w:color w:val="000000" w:themeColor="text1"/>
+                <w:sz w:val="24"/>
+                <w:szCs w:val="24"/>
+              </w:rPr>
+            </w:pPr>
+            <w:proofErr w:type="spellStart"/>
+            <w:r>
+              <w:rPr>
+                <w:rFonts w:ascii="Times New Roman" w:hAnsi="Times New Roman" w:cs="Times New Roman"/>
+                <w:b/>
+                <w:bCs/>
+                <w:color w:val="000000" w:themeColor="text1"/>
+                <w:sz w:val="24"/>
+                <w:szCs w:val="24"/>
+              </w:rPr>
               <w:t>Описание</w:t>
             </w:r>
+            <w:proofErr w:type="spellEnd"/>
           </w:p>
         </w:tc>
       </w:tr>
       <w:tr>
-        <w:tblPrEx>
-          <w:tblCellMar>
-            <w:top w:w="0" w:type="dxa"/>
-            <w:bottom w:w="0" w:type="dxa"/>
-          </w:tblCellMar>
-        </w:tblPrEx>
         <w:tc>
           <w:tcPr>
             <w:tcW w:w="2600" w:type="dxa"/>
@@ -2426,6 +2928,7 @@
                 <w:szCs w:val="24"/>
               </w:rPr>
             </w:pPr>
+            <w:proofErr w:type="spellStart"/>
             <w:r>
               <w:rPr>
                 <w:rFonts w:ascii="Times New Roman" w:eastAsia="Consolas" w:hAnsi="Times New Roman" w:cs="Times New Roman"/>
@@ -2435,6 +2938,7 @@
               </w:rPr>
               <w:t>sale_key</w:t>
             </w:r>
+            <w:proofErr w:type="spellEnd"/>
           </w:p>
         </w:tc>
         <w:tc>
@@ -2476,25 +2980,81 @@
                 <w:szCs w:val="24"/>
               </w:rPr>
             </w:pPr>
-            <w:r>
-              <w:rPr>
-                <w:rFonts w:ascii="Times New Roman" w:hAnsi="Times New Roman" w:cs="Times New Roman"/>
-                <w:color w:val="000000" w:themeColor="text1"/>
-                <w:sz w:val="24"/>
-                <w:szCs w:val="24"/>
-              </w:rPr>
-              <w:t>Суррогатный ключ строки факта</w:t>
-            </w:r>
+            <w:proofErr w:type="spellStart"/>
+            <w:r>
+              <w:rPr>
+                <w:rFonts w:ascii="Times New Roman" w:hAnsi="Times New Roman" w:cs="Times New Roman"/>
+                <w:color w:val="000000" w:themeColor="text1"/>
+                <w:sz w:val="24"/>
+                <w:szCs w:val="24"/>
+              </w:rPr>
+              <w:t>Суррогатный</w:t>
+            </w:r>
+            <w:proofErr w:type="spellEnd"/>
+            <w:r>
+              <w:rPr>
+                <w:rFonts w:ascii="Times New Roman" w:hAnsi="Times New Roman" w:cs="Times New Roman"/>
+                <w:color w:val="000000" w:themeColor="text1"/>
+                <w:sz w:val="24"/>
+                <w:szCs w:val="24"/>
+              </w:rPr>
+              <w:t xml:space="preserve"> </w:t>
+            </w:r>
+            <w:proofErr w:type="spellStart"/>
+            <w:r>
+              <w:rPr>
+                <w:rFonts w:ascii="Times New Roman" w:hAnsi="Times New Roman" w:cs="Times New Roman"/>
+                <w:color w:val="000000" w:themeColor="text1"/>
+                <w:sz w:val="24"/>
+                <w:szCs w:val="24"/>
+              </w:rPr>
+              <w:t>ключ</w:t>
+            </w:r>
+            <w:proofErr w:type="spellEnd"/>
+            <w:r>
+              <w:rPr>
+                <w:rFonts w:ascii="Times New Roman" w:hAnsi="Times New Roman" w:cs="Times New Roman"/>
+                <w:color w:val="000000" w:themeColor="text1"/>
+                <w:sz w:val="24"/>
+                <w:szCs w:val="24"/>
+              </w:rPr>
+              <w:t xml:space="preserve"> </w:t>
+            </w:r>
+            <w:proofErr w:type="spellStart"/>
+            <w:r>
+              <w:rPr>
+                <w:rFonts w:ascii="Times New Roman" w:hAnsi="Times New Roman" w:cs="Times New Roman"/>
+                <w:color w:val="000000" w:themeColor="text1"/>
+                <w:sz w:val="24"/>
+                <w:szCs w:val="24"/>
+              </w:rPr>
+              <w:t>строки</w:t>
+            </w:r>
+            <w:proofErr w:type="spellEnd"/>
+            <w:r>
+              <w:rPr>
+                <w:rFonts w:ascii="Times New Roman" w:hAnsi="Times New Roman" w:cs="Times New Roman"/>
+                <w:color w:val="000000" w:themeColor="text1"/>
+                <w:sz w:val="24"/>
+                <w:szCs w:val="24"/>
+              </w:rPr>
+              <w:t xml:space="preserve"> </w:t>
+            </w:r>
+            <w:proofErr w:type="spellStart"/>
+            <w:r>
+              <w:rPr>
+                <w:rFonts w:ascii="Times New Roman" w:hAnsi="Times New Roman" w:cs="Times New Roman"/>
+                <w:color w:val="000000" w:themeColor="text1"/>
+                <w:sz w:val="24"/>
+                <w:szCs w:val="24"/>
+              </w:rPr>
+              <w:t>факта</w:t>
+            </w:r>
+            <w:proofErr w:type="spellEnd"/>
           </w:p>
         </w:tc>
       </w:tr>
       <w:tr>
-        <w:tblPrEx>
-          <w:tblCellMar>
-            <w:top w:w="0" w:type="dxa"/>
-            <w:bottom w:w="0" w:type="dxa"/>
-          </w:tblCellMar>
-        </w:tblPrEx>
         <w:tc>
           <w:tcPr>
             <w:tcW w:w="2600" w:type="dxa"/>
@@ -2509,6 +3069,7 @@
                 <w:szCs w:val="24"/>
               </w:rPr>
             </w:pPr>
+            <w:proofErr w:type="spellStart"/>
             <w:r>
               <w:rPr>
                 <w:rFonts w:ascii="Times New Roman" w:eastAsia="Consolas" w:hAnsi="Times New Roman" w:cs="Times New Roman"/>
@@ -2518,6 +3079,7 @@
               </w:rPr>
               <w:t>date_key</w:t>
             </w:r>
+            <w:proofErr w:type="spellEnd"/>
           </w:p>
         </w:tc>
         <w:tc>
@@ -2559,25 +3121,61 @@
                 <w:szCs w:val="24"/>
               </w:rPr>
             </w:pPr>
-            <w:r>
-              <w:rPr>
-                <w:rFonts w:ascii="Times New Roman" w:hAnsi="Times New Roman" w:cs="Times New Roman"/>
-                <w:color w:val="000000" w:themeColor="text1"/>
-                <w:sz w:val="24"/>
-                <w:szCs w:val="24"/>
-              </w:rPr>
-              <w:t>Ссылка на Dim_Date</w:t>
-            </w:r>
+            <w:proofErr w:type="spellStart"/>
+            <w:r>
+              <w:rPr>
+                <w:rFonts w:ascii="Times New Roman" w:hAnsi="Times New Roman" w:cs="Times New Roman"/>
+                <w:color w:val="000000" w:themeColor="text1"/>
+                <w:sz w:val="24"/>
+                <w:szCs w:val="24"/>
+              </w:rPr>
+              <w:t>Ссылка</w:t>
+            </w:r>
+            <w:proofErr w:type="spellEnd"/>
+            <w:r>
+              <w:rPr>
+                <w:rFonts w:ascii="Times New Roman" w:hAnsi="Times New Roman" w:cs="Times New Roman"/>
+                <w:color w:val="000000" w:themeColor="text1"/>
+                <w:sz w:val="24"/>
+                <w:szCs w:val="24"/>
+              </w:rPr>
+              <w:t xml:space="preserve"> </w:t>
+            </w:r>
+            <w:proofErr w:type="spellStart"/>
+            <w:r>
+              <w:rPr>
+                <w:rFonts w:ascii="Times New Roman" w:hAnsi="Times New Roman" w:cs="Times New Roman"/>
+                <w:color w:val="000000" w:themeColor="text1"/>
+                <w:sz w:val="24"/>
+                <w:szCs w:val="24"/>
+              </w:rPr>
+              <w:t>на</w:t>
+            </w:r>
+            <w:proofErr w:type="spellEnd"/>
+            <w:r>
+              <w:rPr>
+                <w:rFonts w:ascii="Times New Roman" w:hAnsi="Times New Roman" w:cs="Times New Roman"/>
+                <w:color w:val="000000" w:themeColor="text1"/>
+                <w:sz w:val="24"/>
+                <w:szCs w:val="24"/>
+              </w:rPr>
+              <w:t xml:space="preserve"> </w:t>
+            </w:r>
+            <w:proofErr w:type="spellStart"/>
+            <w:r>
+              <w:rPr>
+                <w:rFonts w:ascii="Times New Roman" w:hAnsi="Times New Roman" w:cs="Times New Roman"/>
+                <w:color w:val="000000" w:themeColor="text1"/>
+                <w:sz w:val="24"/>
+                <w:szCs w:val="24"/>
+              </w:rPr>
+              <w:t>Dim_Date</w:t>
+            </w:r>
+            <w:proofErr w:type="spellEnd"/>
           </w:p>
         </w:tc>
       </w:tr>
       <w:tr>
-        <w:tblPrEx>
-          <w:tblCellMar>
-            <w:top w:w="0" w:type="dxa"/>
-            <w:bottom w:w="0" w:type="dxa"/>
-          </w:tblCellMar>
-        </w:tblPrEx>
         <w:tc>
           <w:tcPr>
             <w:tcW w:w="2600" w:type="dxa"/>
@@ -2592,6 +3190,7 @@
                 <w:szCs w:val="24"/>
               </w:rPr>
             </w:pPr>
+            <w:proofErr w:type="spellStart"/>
             <w:r>
               <w:rPr>
                 <w:rFonts w:ascii="Times New Roman" w:eastAsia="Consolas" w:hAnsi="Times New Roman" w:cs="Times New Roman"/>
@@ -2601,6 +3200,7 @@
               </w:rPr>
               <w:t>customer_key</w:t>
             </w:r>
+            <w:proofErr w:type="spellEnd"/>
           </w:p>
         </w:tc>
         <w:tc>
@@ -2642,25 +3242,61 @@
                 <w:szCs w:val="24"/>
               </w:rPr>
             </w:pPr>
-            <w:r>
-              <w:rPr>
-                <w:rFonts w:ascii="Times New Roman" w:hAnsi="Times New Roman" w:cs="Times New Roman"/>
-                <w:color w:val="000000" w:themeColor="text1"/>
-                <w:sz w:val="24"/>
-                <w:szCs w:val="24"/>
-              </w:rPr>
-              <w:t>Ссылка на Dim_Customer</w:t>
-            </w:r>
+            <w:proofErr w:type="spellStart"/>
+            <w:r>
+              <w:rPr>
+                <w:rFonts w:ascii="Times New Roman" w:hAnsi="Times New Roman" w:cs="Times New Roman"/>
+                <w:color w:val="000000" w:themeColor="text1"/>
+                <w:sz w:val="24"/>
+                <w:szCs w:val="24"/>
+              </w:rPr>
+              <w:t>Ссылка</w:t>
+            </w:r>
+            <w:proofErr w:type="spellEnd"/>
+            <w:r>
+              <w:rPr>
+                <w:rFonts w:ascii="Times New Roman" w:hAnsi="Times New Roman" w:cs="Times New Roman"/>
+                <w:color w:val="000000" w:themeColor="text1"/>
+                <w:sz w:val="24"/>
+                <w:szCs w:val="24"/>
+              </w:rPr>
+              <w:t xml:space="preserve"> </w:t>
+            </w:r>
+            <w:proofErr w:type="spellStart"/>
+            <w:r>
+              <w:rPr>
+                <w:rFonts w:ascii="Times New Roman" w:hAnsi="Times New Roman" w:cs="Times New Roman"/>
+                <w:color w:val="000000" w:themeColor="text1"/>
+                <w:sz w:val="24"/>
+                <w:szCs w:val="24"/>
+              </w:rPr>
+              <w:t>на</w:t>
+            </w:r>
+            <w:proofErr w:type="spellEnd"/>
+            <w:r>
+              <w:rPr>
+                <w:rFonts w:ascii="Times New Roman" w:hAnsi="Times New Roman" w:cs="Times New Roman"/>
+                <w:color w:val="000000" w:themeColor="text1"/>
+                <w:sz w:val="24"/>
+                <w:szCs w:val="24"/>
+              </w:rPr>
+              <w:t xml:space="preserve"> </w:t>
+            </w:r>
+            <w:proofErr w:type="spellStart"/>
+            <w:r>
+              <w:rPr>
+                <w:rFonts w:ascii="Times New Roman" w:hAnsi="Times New Roman" w:cs="Times New Roman"/>
+                <w:color w:val="000000" w:themeColor="text1"/>
+                <w:sz w:val="24"/>
+                <w:szCs w:val="24"/>
+              </w:rPr>
+              <w:t>Dim_Customer</w:t>
+            </w:r>
+            <w:proofErr w:type="spellEnd"/>
           </w:p>
         </w:tc>
       </w:tr>
       <w:tr>
-        <w:tblPrEx>
-          <w:tblCellMar>
-            <w:top w:w="0" w:type="dxa"/>
-            <w:bottom w:w="0" w:type="dxa"/>
-          </w:tblCellMar>
-        </w:tblPrEx>
         <w:tc>
           <w:tcPr>
             <w:tcW w:w="2600" w:type="dxa"/>
@@ -2675,6 +3311,7 @@
                 <w:szCs w:val="24"/>
               </w:rPr>
             </w:pPr>
+            <w:proofErr w:type="spellStart"/>
             <w:r>
               <w:rPr>
                 <w:rFonts w:ascii="Times New Roman" w:eastAsia="Consolas" w:hAnsi="Times New Roman" w:cs="Times New Roman"/>
@@ -2684,6 +3321,7 @@
               </w:rPr>
               <w:t>product_key</w:t>
             </w:r>
+            <w:proofErr w:type="spellEnd"/>
           </w:p>
         </w:tc>
         <w:tc>
@@ -2725,25 +3363,61 @@
                 <w:szCs w:val="24"/>
               </w:rPr>
             </w:pPr>
-            <w:r>
-              <w:rPr>
-                <w:rFonts w:ascii="Times New Roman" w:hAnsi="Times New Roman" w:cs="Times New Roman"/>
-                <w:color w:val="000000" w:themeColor="text1"/>
-                <w:sz w:val="24"/>
-                <w:szCs w:val="24"/>
-              </w:rPr>
-              <w:t>Ссылка на Dim_Product</w:t>
-            </w:r>
+            <w:proofErr w:type="spellStart"/>
+            <w:r>
+              <w:rPr>
+                <w:rFonts w:ascii="Times New Roman" w:hAnsi="Times New Roman" w:cs="Times New Roman"/>
+                <w:color w:val="000000" w:themeColor="text1"/>
+                <w:sz w:val="24"/>
+                <w:szCs w:val="24"/>
+              </w:rPr>
+              <w:t>Ссылка</w:t>
+            </w:r>
+            <w:proofErr w:type="spellEnd"/>
+            <w:r>
+              <w:rPr>
+                <w:rFonts w:ascii="Times New Roman" w:hAnsi="Times New Roman" w:cs="Times New Roman"/>
+                <w:color w:val="000000" w:themeColor="text1"/>
+                <w:sz w:val="24"/>
+                <w:szCs w:val="24"/>
+              </w:rPr>
+              <w:t xml:space="preserve"> </w:t>
+            </w:r>
+            <w:proofErr w:type="spellStart"/>
+            <w:r>
+              <w:rPr>
+                <w:rFonts w:ascii="Times New Roman" w:hAnsi="Times New Roman" w:cs="Times New Roman"/>
+                <w:color w:val="000000" w:themeColor="text1"/>
+                <w:sz w:val="24"/>
+                <w:szCs w:val="24"/>
+              </w:rPr>
+              <w:t>на</w:t>
+            </w:r>
+            <w:proofErr w:type="spellEnd"/>
+            <w:r>
+              <w:rPr>
+                <w:rFonts w:ascii="Times New Roman" w:hAnsi="Times New Roman" w:cs="Times New Roman"/>
+                <w:color w:val="000000" w:themeColor="text1"/>
+                <w:sz w:val="24"/>
+                <w:szCs w:val="24"/>
+              </w:rPr>
+              <w:t xml:space="preserve"> </w:t>
+            </w:r>
+            <w:proofErr w:type="spellStart"/>
+            <w:r>
+              <w:rPr>
+                <w:rFonts w:ascii="Times New Roman" w:hAnsi="Times New Roman" w:cs="Times New Roman"/>
+                <w:color w:val="000000" w:themeColor="text1"/>
+                <w:sz w:val="24"/>
+                <w:szCs w:val="24"/>
+              </w:rPr>
+              <w:t>Dim_Product</w:t>
+            </w:r>
+            <w:proofErr w:type="spellEnd"/>
           </w:p>
         </w:tc>
       </w:tr>
       <w:tr>
-        <w:tblPrEx>
-          <w:tblCellMar>
-            <w:top w:w="0" w:type="dxa"/>
-            <w:bottom w:w="0" w:type="dxa"/>
-          </w:tblCellMar>
-        </w:tblPrEx>
         <w:tc>
           <w:tcPr>
             <w:tcW w:w="2600" w:type="dxa"/>
@@ -2758,6 +3432,7 @@
                 <w:szCs w:val="24"/>
               </w:rPr>
             </w:pPr>
+            <w:proofErr w:type="spellStart"/>
             <w:r>
               <w:rPr>
                 <w:rFonts w:ascii="Times New Roman" w:eastAsia="Consolas" w:hAnsi="Times New Roman" w:cs="Times New Roman"/>
@@ -2767,6 +3442,7 @@
               </w:rPr>
               <w:t>order_id</w:t>
             </w:r>
+            <w:proofErr w:type="spellEnd"/>
           </w:p>
         </w:tc>
         <w:tc>
@@ -2823,12 +3499,6 @@
         </w:tc>
       </w:tr>
       <w:tr>
-        <w:tblPrEx>
-          <w:tblCellMar>
-            <w:top w:w="0" w:type="dxa"/>
-            <w:bottom w:w="0" w:type="dxa"/>
-          </w:tblCellMar>
-        </w:tblPrEx>
         <w:tc>
           <w:tcPr>
             <w:tcW w:w="2600" w:type="dxa"/>
@@ -2875,8 +3545,19 @@
                 <w:sz w:val="24"/>
                 <w:szCs w:val="24"/>
               </w:rPr>
-              <w:t>INT — метрика</w:t>
-            </w:r>
+              <w:t xml:space="preserve">INT — </w:t>
+            </w:r>
+            <w:proofErr w:type="spellStart"/>
+            <w:r>
+              <w:rPr>
+                <w:rFonts w:ascii="Times New Roman" w:hAnsi="Times New Roman" w:cs="Times New Roman"/>
+                <w:color w:val="000000" w:themeColor="text1"/>
+                <w:sz w:val="24"/>
+                <w:szCs w:val="24"/>
+              </w:rPr>
+              <w:t>метрика</w:t>
+            </w:r>
+            <w:proofErr w:type="spellEnd"/>
           </w:p>
         </w:tc>
         <w:tc>
@@ -2893,25 +3574,41 @@
                 <w:szCs w:val="24"/>
               </w:rPr>
             </w:pPr>
-            <w:r>
-              <w:rPr>
-                <w:rFonts w:ascii="Times New Roman" w:hAnsi="Times New Roman" w:cs="Times New Roman"/>
-                <w:color w:val="000000" w:themeColor="text1"/>
-                <w:sz w:val="24"/>
-                <w:szCs w:val="24"/>
-              </w:rPr>
-              <w:t>Количество товара</w:t>
-            </w:r>
+            <w:proofErr w:type="spellStart"/>
+            <w:r>
+              <w:rPr>
+                <w:rFonts w:ascii="Times New Roman" w:hAnsi="Times New Roman" w:cs="Times New Roman"/>
+                <w:color w:val="000000" w:themeColor="text1"/>
+                <w:sz w:val="24"/>
+                <w:szCs w:val="24"/>
+              </w:rPr>
+              <w:t>Количество</w:t>
+            </w:r>
+            <w:proofErr w:type="spellEnd"/>
+            <w:r>
+              <w:rPr>
+                <w:rFonts w:ascii="Times New Roman" w:hAnsi="Times New Roman" w:cs="Times New Roman"/>
+                <w:color w:val="000000" w:themeColor="text1"/>
+                <w:sz w:val="24"/>
+                <w:szCs w:val="24"/>
+              </w:rPr>
+              <w:t xml:space="preserve"> </w:t>
+            </w:r>
+            <w:proofErr w:type="spellStart"/>
+            <w:r>
+              <w:rPr>
+                <w:rFonts w:ascii="Times New Roman" w:hAnsi="Times New Roman" w:cs="Times New Roman"/>
+                <w:color w:val="000000" w:themeColor="text1"/>
+                <w:sz w:val="24"/>
+                <w:szCs w:val="24"/>
+              </w:rPr>
+              <w:t>товара</w:t>
+            </w:r>
+            <w:proofErr w:type="spellEnd"/>
           </w:p>
         </w:tc>
       </w:tr>
       <w:tr>
-        <w:tblPrEx>
-          <w:tblCellMar>
-            <w:top w:w="0" w:type="dxa"/>
-            <w:bottom w:w="0" w:type="dxa"/>
-          </w:tblCellMar>
-        </w:tblPrEx>
         <w:tc>
           <w:tcPr>
             <w:tcW w:w="2600" w:type="dxa"/>
@@ -2926,6 +3623,7 @@
                 <w:szCs w:val="24"/>
               </w:rPr>
             </w:pPr>
+            <w:proofErr w:type="spellStart"/>
             <w:r>
               <w:rPr>
                 <w:rFonts w:ascii="Times New Roman" w:eastAsia="Consolas" w:hAnsi="Times New Roman" w:cs="Times New Roman"/>
@@ -2935,6 +3633,7 @@
               </w:rPr>
               <w:t>unit_price</w:t>
             </w:r>
+            <w:proofErr w:type="spellEnd"/>
           </w:p>
         </w:tc>
         <w:tc>
@@ -2958,8 +3657,19 @@
                 <w:sz w:val="24"/>
                 <w:szCs w:val="24"/>
               </w:rPr>
-              <w:t>NUMERIC(10,2) — метрика</w:t>
-            </w:r>
+              <w:t xml:space="preserve">NUMERIC(10,2) — </w:t>
+            </w:r>
+            <w:proofErr w:type="spellStart"/>
+            <w:r>
+              <w:rPr>
+                <w:rFonts w:ascii="Times New Roman" w:hAnsi="Times New Roman" w:cs="Times New Roman"/>
+                <w:color w:val="000000" w:themeColor="text1"/>
+                <w:sz w:val="24"/>
+                <w:szCs w:val="24"/>
+              </w:rPr>
+              <w:t>метрика</w:t>
+            </w:r>
+            <w:proofErr w:type="spellEnd"/>
           </w:p>
         </w:tc>
         <w:tc>
@@ -2974,27 +3684,33 @@
                 <w:color w:val="000000" w:themeColor="text1"/>
                 <w:sz w:val="24"/>
                 <w:szCs w:val="24"/>
-              </w:rPr>
-            </w:pPr>
-            <w:r>
-              <w:rPr>
-                <w:rFonts w:ascii="Times New Roman" w:hAnsi="Times New Roman" w:cs="Times New Roman"/>
-                <w:color w:val="000000" w:themeColor="text1"/>
-                <w:sz w:val="24"/>
-                <w:szCs w:val="24"/>
+                <w:lang w:val="ru-RU"/>
+              </w:rPr>
+            </w:pPr>
+            <w:r>
+              <w:rPr>
+                <w:rFonts w:ascii="Times New Roman" w:hAnsi="Times New Roman" w:cs="Times New Roman"/>
+                <w:color w:val="000000" w:themeColor="text1"/>
+                <w:sz w:val="24"/>
+                <w:szCs w:val="24"/>
+                <w:lang w:val="ru-RU"/>
               </w:rPr>
               <w:t>Цена за единицу</w:t>
+            </w:r>
+            <w:r>
+              <w:rPr>
+                <w:rFonts w:ascii="Times New Roman" w:hAnsi="Times New Roman" w:cs="Times New Roman"/>
+                <w:color w:val="000000" w:themeColor="text1"/>
+                <w:sz w:val="24"/>
+                <w:szCs w:val="24"/>
+                <w:lang w:val="ru-RU"/>
+              </w:rPr>
+              <w:t xml:space="preserve"> (по факту покупки)</w:t>
             </w:r>
           </w:p>
         </w:tc>
       </w:tr>
       <w:tr>
-        <w:tblPrEx>
-          <w:tblCellMar>
-            <w:top w:w="0" w:type="dxa"/>
-            <w:bottom w:w="0" w:type="dxa"/>
-          </w:tblCellMar>
-        </w:tblPrEx>
         <w:tc>
           <w:tcPr>
             <w:tcW w:w="2600" w:type="dxa"/>
@@ -3009,6 +3725,7 @@
                 <w:szCs w:val="24"/>
               </w:rPr>
             </w:pPr>
+            <w:proofErr w:type="spellStart"/>
             <w:r>
               <w:rPr>
                 <w:rFonts w:ascii="Times New Roman" w:eastAsia="Consolas" w:hAnsi="Times New Roman" w:cs="Times New Roman"/>
@@ -3018,6 +3735,9 @@
               </w:rPr>
               <w:t>total_amount</w:t>
             </w:r>
+            <w:bookmarkStart w:id="0" w:name="_GoBack"/>
+            <w:bookmarkEnd w:id="0"/>
+            <w:proofErr w:type="spellEnd"/>
           </w:p>
         </w:tc>
         <w:tc>
@@ -3041,8 +3761,19 @@
                 <w:sz w:val="24"/>
                 <w:szCs w:val="24"/>
               </w:rPr>
-              <w:t>NUMERIC(10,2) — метрика</w:t>
-            </w:r>
+              <w:t xml:space="preserve">NUMERIC(10,2) — </w:t>
+            </w:r>
+            <w:proofErr w:type="spellStart"/>
+            <w:r>
+              <w:rPr>
+                <w:rFonts w:ascii="Times New Roman" w:hAnsi="Times New Roman" w:cs="Times New Roman"/>
+                <w:color w:val="000000" w:themeColor="text1"/>
+                <w:sz w:val="24"/>
+                <w:szCs w:val="24"/>
+              </w:rPr>
+              <w:t>метрика</w:t>
+            </w:r>
+            <w:proofErr w:type="spellEnd"/>
           </w:p>
         </w:tc>
         <w:tc>
@@ -3059,15 +3790,37 @@
                 <w:szCs w:val="24"/>
               </w:rPr>
             </w:pPr>
-            <w:r>
-              <w:rPr>
-                <w:rFonts w:ascii="Times New Roman" w:hAnsi="Times New Roman" w:cs="Times New Roman"/>
-                <w:color w:val="000000" w:themeColor="text1"/>
-                <w:sz w:val="24"/>
-                <w:szCs w:val="24"/>
-              </w:rPr>
-              <w:t>Сумма = quantity × unit_price</w:t>
-            </w:r>
+            <w:proofErr w:type="spellStart"/>
+            <w:r>
+              <w:rPr>
+                <w:rFonts w:ascii="Times New Roman" w:hAnsi="Times New Roman" w:cs="Times New Roman"/>
+                <w:color w:val="000000" w:themeColor="text1"/>
+                <w:sz w:val="24"/>
+                <w:szCs w:val="24"/>
+              </w:rPr>
+              <w:t>Сумма</w:t>
+            </w:r>
+            <w:proofErr w:type="spellEnd"/>
+            <w:r>
+              <w:rPr>
+                <w:rFonts w:ascii="Times New Roman" w:hAnsi="Times New Roman" w:cs="Times New Roman"/>
+                <w:color w:val="000000" w:themeColor="text1"/>
+                <w:sz w:val="24"/>
+                <w:szCs w:val="24"/>
+              </w:rPr>
+              <w:t xml:space="preserve"> = quantity × </w:t>
+            </w:r>
+            <w:proofErr w:type="spellStart"/>
+            <w:r>
+              <w:rPr>
+                <w:rFonts w:ascii="Times New Roman" w:hAnsi="Times New Roman" w:cs="Times New Roman"/>
+                <w:color w:val="000000" w:themeColor="text1"/>
+                <w:sz w:val="24"/>
+                <w:szCs w:val="24"/>
+              </w:rPr>
+              <w:t>unit_price</w:t>
+            </w:r>
+            <w:proofErr w:type="spellEnd"/>
           </w:p>
         </w:tc>
       </w:tr>
@@ -3089,7 +3842,27 @@
           <w:sz w:val="24"/>
           <w:szCs w:val="24"/>
         </w:rPr>
-        <w:t>Part 4. Схема (Star Schema)</w:t>
+        <w:t xml:space="preserve">Part 4. </w:t>
+      </w:r>
+      <w:proofErr w:type="spellStart"/>
+      <w:r>
+        <w:rPr>
+          <w:rFonts w:ascii="Times New Roman" w:hAnsi="Times New Roman" w:cs="Times New Roman"/>
+          <w:color w:val="000000" w:themeColor="text1"/>
+          <w:sz w:val="24"/>
+          <w:szCs w:val="24"/>
+        </w:rPr>
+        <w:t>Схема</w:t>
+      </w:r>
+      <w:proofErr w:type="spellEnd"/>
+      <w:r>
+        <w:rPr>
+          <w:rFonts w:ascii="Times New Roman" w:hAnsi="Times New Roman" w:cs="Times New Roman"/>
+          <w:color w:val="000000" w:themeColor="text1"/>
+          <w:sz w:val="24"/>
+          <w:szCs w:val="24"/>
+        </w:rPr>
+        <w:t xml:space="preserve"> (Star Schema)</w:t>
       </w:r>
     </w:p>
     <w:p>
@@ -3111,9 +3884,9 @@
           <w:szCs w:val="24"/>
         </w:rPr>
         <w:drawing>
-          <wp:inline distT="0" distB="0" distL="0" distR="0" wp14:anchorId="7B14B505" wp14:editId="3FF67A54">
-            <wp:extent cx="5363323" cy="4963218"/>
-            <wp:effectExtent l="0" t="0" r="8890" b="8890"/>
+          <wp:inline distT="0" distB="0" distL="0" distR="0" wp14:anchorId="1A18761D" wp14:editId="640DF6D6">
+            <wp:extent cx="3936618" cy="3562709"/>
+            <wp:effectExtent l="0" t="0" r="6985" b="0"/>
             <wp:docPr id="1" name="Рисунок 1"/>
             <wp:cNvGraphicFramePr>
               <a:graphicFrameLocks xmlns:a="http://schemas.openxmlformats.org/drawingml/2006/main" noChangeAspect="1"/>
@@ -3134,7 +3907,7 @@
                   <pic:spPr>
                     <a:xfrm>
                       <a:off x="0" y="0"/>
-                      <a:ext cx="5363323" cy="4963218"/>
+                      <a:ext cx="3947860" cy="3572883"/>
                     </a:xfrm>
                     <a:prstGeom prst="rect">
                       <a:avLst/>
@@ -3164,9 +3937,19 @@
           <w:sz w:val="24"/>
           <w:szCs w:val="24"/>
         </w:rPr>
-        <w:lastRenderedPageBreak/>
-        <w:t>Part 5. Запросы</w:t>
-      </w:r>
+        <w:t xml:space="preserve">Part 5. </w:t>
+      </w:r>
+      <w:proofErr w:type="spellStart"/>
+      <w:r>
+        <w:rPr>
+          <w:rFonts w:ascii="Times New Roman" w:hAnsi="Times New Roman" w:cs="Times New Roman"/>
+          <w:color w:val="000000" w:themeColor="text1"/>
+          <w:sz w:val="24"/>
+          <w:szCs w:val="24"/>
+        </w:rPr>
+        <w:t>Запросы</w:t>
+      </w:r>
+      <w:proofErr w:type="spellEnd"/>
     </w:p>
     <w:p>
       <w:pPr>
@@ -3185,8 +3968,59 @@
           <w:sz w:val="24"/>
           <w:szCs w:val="24"/>
         </w:rPr>
-        <w:t>1. Выручка по категориям</w:t>
-      </w:r>
+        <w:t xml:space="preserve">1. </w:t>
+      </w:r>
+      <w:proofErr w:type="spellStart"/>
+      <w:r>
+        <w:rPr>
+          <w:rFonts w:ascii="Times New Roman" w:hAnsi="Times New Roman" w:cs="Times New Roman"/>
+          <w:color w:val="000000" w:themeColor="text1"/>
+          <w:sz w:val="24"/>
+          <w:szCs w:val="24"/>
+        </w:rPr>
+        <w:t>Выручка</w:t>
+      </w:r>
+      <w:proofErr w:type="spellEnd"/>
+      <w:r>
+        <w:rPr>
+          <w:rFonts w:ascii="Times New Roman" w:hAnsi="Times New Roman" w:cs="Times New Roman"/>
+          <w:color w:val="000000" w:themeColor="text1"/>
+          <w:sz w:val="24"/>
+          <w:szCs w:val="24"/>
+        </w:rPr>
+        <w:t xml:space="preserve"> </w:t>
+      </w:r>
+      <w:proofErr w:type="spellStart"/>
+      <w:r>
+        <w:rPr>
+          <w:rFonts w:ascii="Times New Roman" w:hAnsi="Times New Roman" w:cs="Times New Roman"/>
+          <w:color w:val="000000" w:themeColor="text1"/>
+          <w:sz w:val="24"/>
+          <w:szCs w:val="24"/>
+        </w:rPr>
+        <w:t>по</w:t>
+      </w:r>
+      <w:proofErr w:type="spellEnd"/>
+      <w:r>
+        <w:rPr>
+          <w:rFonts w:ascii="Times New Roman" w:hAnsi="Times New Roman" w:cs="Times New Roman"/>
+          <w:color w:val="000000" w:themeColor="text1"/>
+          <w:sz w:val="24"/>
+          <w:szCs w:val="24"/>
+        </w:rPr>
+        <w:t xml:space="preserve"> </w:t>
+      </w:r>
+      <w:proofErr w:type="spellStart"/>
+      <w:r>
+        <w:rPr>
+          <w:rFonts w:ascii="Times New Roman" w:hAnsi="Times New Roman" w:cs="Times New Roman"/>
+          <w:color w:val="000000" w:themeColor="text1"/>
+          <w:sz w:val="24"/>
+          <w:szCs w:val="24"/>
+        </w:rPr>
+        <w:t>категориям</w:t>
+      </w:r>
+      <w:proofErr w:type="spellEnd"/>
     </w:p>
     <w:p>
       <w:pPr>
@@ -3198,29 +4032,115 @@
         <w:rPr>
           <w:rFonts w:ascii="Times New Roman" w:hAnsi="Times New Roman" w:cs="Times New Roman"/>
         </w:rPr>
-        <w:t>SELECT p.category_name, SUM(f.total_amount) AS revenue</w:t>
+        <w:t xml:space="preserve">SELECT </w:t>
+      </w:r>
+      <w:proofErr w:type="spellStart"/>
+      <w:r>
+        <w:rPr>
+          <w:rFonts w:ascii="Times New Roman" w:hAnsi="Times New Roman" w:cs="Times New Roman"/>
+        </w:rPr>
+        <w:t>p.category_name</w:t>
+      </w:r>
+      <w:proofErr w:type="spellEnd"/>
+      <w:r>
+        <w:rPr>
+          <w:rFonts w:ascii="Times New Roman" w:hAnsi="Times New Roman" w:cs="Times New Roman"/>
+        </w:rPr>
+        <w:t>, SUM(</w:t>
+      </w:r>
+      <w:proofErr w:type="spellStart"/>
+      <w:r>
+        <w:rPr>
+          <w:rFonts w:ascii="Times New Roman" w:hAnsi="Times New Roman" w:cs="Times New Roman"/>
+        </w:rPr>
+        <w:t>f.total_amount</w:t>
+      </w:r>
+      <w:proofErr w:type="spellEnd"/>
+      <w:r>
+        <w:rPr>
+          <w:rFonts w:ascii="Times New Roman" w:hAnsi="Times New Roman" w:cs="Times New Roman"/>
+        </w:rPr>
+        <w:t>) AS revenue</w:t>
       </w:r>
       <w:r>
         <w:rPr>
           <w:rFonts w:ascii="Times New Roman" w:hAnsi="Times New Roman" w:cs="Times New Roman"/>
         </w:rPr>
         <w:br/>
-        <w:t>FROM fact_sales f</w:t>
+        <w:t xml:space="preserve">FROM </w:t>
+      </w:r>
+      <w:proofErr w:type="spellStart"/>
+      <w:r>
+        <w:rPr>
+          <w:rFonts w:ascii="Times New Roman" w:hAnsi="Times New Roman" w:cs="Times New Roman"/>
+        </w:rPr>
+        <w:t>fact_sales</w:t>
+      </w:r>
+      <w:proofErr w:type="spellEnd"/>
+      <w:r>
+        <w:rPr>
+          <w:rFonts w:ascii="Times New Roman" w:hAnsi="Times New Roman" w:cs="Times New Roman"/>
+        </w:rPr>
+        <w:t xml:space="preserve"> f</w:t>
       </w:r>
       <w:r>
         <w:rPr>
           <w:rFonts w:ascii="Times New Roman" w:hAnsi="Times New Roman" w:cs="Times New Roman"/>
         </w:rPr>
         <w:br/>
-        <w:t>JOIN dim_product p ON f.product_key = p.product_key</w:t>
-      </w:r>
+        <w:t xml:space="preserve">JOIN </w:t>
+      </w:r>
+      <w:proofErr w:type="spellStart"/>
+      <w:r>
+        <w:rPr>
+          <w:rFonts w:ascii="Times New Roman" w:hAnsi="Times New Roman" w:cs="Times New Roman"/>
+        </w:rPr>
+        <w:t>dim_product</w:t>
+      </w:r>
+      <w:proofErr w:type="spellEnd"/>
+      <w:r>
+        <w:rPr>
+          <w:rFonts w:ascii="Times New Roman" w:hAnsi="Times New Roman" w:cs="Times New Roman"/>
+        </w:rPr>
+        <w:t xml:space="preserve"> p ON </w:t>
+      </w:r>
+      <w:proofErr w:type="spellStart"/>
+      <w:r>
+        <w:rPr>
+          <w:rFonts w:ascii="Times New Roman" w:hAnsi="Times New Roman" w:cs="Times New Roman"/>
+        </w:rPr>
+        <w:t>f.product_key</w:t>
+      </w:r>
+      <w:proofErr w:type="spellEnd"/>
+      <w:r>
+        <w:rPr>
+          <w:rFonts w:ascii="Times New Roman" w:hAnsi="Times New Roman" w:cs="Times New Roman"/>
+        </w:rPr>
+        <w:t xml:space="preserve"> = </w:t>
+      </w:r>
+      <w:proofErr w:type="spellStart"/>
+      <w:r>
+        <w:rPr>
+          <w:rFonts w:ascii="Times New Roman" w:hAnsi="Times New Roman" w:cs="Times New Roman"/>
+        </w:rPr>
+        <w:t>p.product_key</w:t>
+      </w:r>
+      <w:proofErr w:type="spellEnd"/>
       <w:r>
         <w:rPr>
           <w:rFonts w:ascii="Times New Roman" w:hAnsi="Times New Roman" w:cs="Times New Roman"/>
         </w:rPr>
         <w:br/>
-        <w:t>GROUP BY p.category_name</w:t>
-      </w:r>
+        <w:t xml:space="preserve">GROUP BY </w:t>
+      </w:r>
+      <w:proofErr w:type="spellStart"/>
+      <w:r>
+        <w:rPr>
+          <w:rFonts w:ascii="Times New Roman" w:hAnsi="Times New Roman" w:cs="Times New Roman"/>
+        </w:rPr>
+        <w:t>p.category_name</w:t>
+      </w:r>
+      <w:proofErr w:type="spellEnd"/>
       <w:r>
         <w:rPr>
           <w:rFonts w:ascii="Times New Roman" w:hAnsi="Times New Roman" w:cs="Times New Roman"/>
@@ -3246,8 +4166,60 @@
           <w:sz w:val="24"/>
           <w:szCs w:val="24"/>
         </w:rPr>
-        <w:t>2. ТОП-5 товаров по выручке</w:t>
-      </w:r>
+        <w:lastRenderedPageBreak/>
+        <w:t xml:space="preserve">2. ТОП-5 </w:t>
+      </w:r>
+      <w:proofErr w:type="spellStart"/>
+      <w:r>
+        <w:rPr>
+          <w:rFonts w:ascii="Times New Roman" w:hAnsi="Times New Roman" w:cs="Times New Roman"/>
+          <w:color w:val="000000" w:themeColor="text1"/>
+          <w:sz w:val="24"/>
+          <w:szCs w:val="24"/>
+        </w:rPr>
+        <w:t>товаров</w:t>
+      </w:r>
+      <w:proofErr w:type="spellEnd"/>
+      <w:r>
+        <w:rPr>
+          <w:rFonts w:ascii="Times New Roman" w:hAnsi="Times New Roman" w:cs="Times New Roman"/>
+          <w:color w:val="000000" w:themeColor="text1"/>
+          <w:sz w:val="24"/>
+          <w:szCs w:val="24"/>
+        </w:rPr>
+        <w:t xml:space="preserve"> </w:t>
+      </w:r>
+      <w:proofErr w:type="spellStart"/>
+      <w:r>
+        <w:rPr>
+          <w:rFonts w:ascii="Times New Roman" w:hAnsi="Times New Roman" w:cs="Times New Roman"/>
+          <w:color w:val="000000" w:themeColor="text1"/>
+          <w:sz w:val="24"/>
+          <w:szCs w:val="24"/>
+        </w:rPr>
+        <w:t>по</w:t>
+      </w:r>
+      <w:proofErr w:type="spellEnd"/>
+      <w:r>
+        <w:rPr>
+          <w:rFonts w:ascii="Times New Roman" w:hAnsi="Times New Roman" w:cs="Times New Roman"/>
+          <w:color w:val="000000" w:themeColor="text1"/>
+          <w:sz w:val="24"/>
+          <w:szCs w:val="24"/>
+        </w:rPr>
+        <w:t xml:space="preserve"> </w:t>
+      </w:r>
+      <w:proofErr w:type="spellStart"/>
+      <w:r>
+        <w:rPr>
+          <w:rFonts w:ascii="Times New Roman" w:hAnsi="Times New Roman" w:cs="Times New Roman"/>
+          <w:color w:val="000000" w:themeColor="text1"/>
+          <w:sz w:val="24"/>
+          <w:szCs w:val="24"/>
+        </w:rPr>
+        <w:t>выручке</w:t>
+      </w:r>
+      <w:proofErr w:type="spellEnd"/>
     </w:p>
     <w:p>
       <w:pPr>
@@ -3259,42 +4231,150 @@
         <w:rPr>
           <w:rFonts w:ascii="Times New Roman" w:hAnsi="Times New Roman" w:cs="Times New Roman"/>
         </w:rPr>
-        <w:t>SELECT p.product_name, SUM(f.quantity) AS units_sold,</w:t>
+        <w:t xml:space="preserve">SELECT </w:t>
+      </w:r>
+      <w:proofErr w:type="spellStart"/>
+      <w:r>
+        <w:rPr>
+          <w:rFonts w:ascii="Times New Roman" w:hAnsi="Times New Roman" w:cs="Times New Roman"/>
+        </w:rPr>
+        <w:t>p.product_name</w:t>
+      </w:r>
+      <w:proofErr w:type="spellEnd"/>
+      <w:r>
+        <w:rPr>
+          <w:rFonts w:ascii="Times New Roman" w:hAnsi="Times New Roman" w:cs="Times New Roman"/>
+        </w:rPr>
+        <w:t>, SUM(</w:t>
+      </w:r>
+      <w:proofErr w:type="spellStart"/>
+      <w:r>
+        <w:rPr>
+          <w:rFonts w:ascii="Times New Roman" w:hAnsi="Times New Roman" w:cs="Times New Roman"/>
+        </w:rPr>
+        <w:t>f.quantity</w:t>
+      </w:r>
+      <w:proofErr w:type="spellEnd"/>
+      <w:r>
+        <w:rPr>
+          <w:rFonts w:ascii="Times New Roman" w:hAnsi="Times New Roman" w:cs="Times New Roman"/>
+        </w:rPr>
+        <w:t xml:space="preserve">) AS </w:t>
+      </w:r>
+      <w:proofErr w:type="spellStart"/>
+      <w:r>
+        <w:rPr>
+          <w:rFonts w:ascii="Times New Roman" w:hAnsi="Times New Roman" w:cs="Times New Roman"/>
+        </w:rPr>
+        <w:t>units_sold</w:t>
+      </w:r>
+      <w:proofErr w:type="spellEnd"/>
+      <w:r>
+        <w:rPr>
+          <w:rFonts w:ascii="Times New Roman" w:hAnsi="Times New Roman" w:cs="Times New Roman"/>
+        </w:rPr>
+        <w:t>,</w:t>
       </w:r>
       <w:r>
         <w:rPr>
           <w:rFonts w:ascii="Times New Roman" w:hAnsi="Times New Roman" w:cs="Times New Roman"/>
         </w:rPr>
         <w:br/>
-        <w:t xml:space="preserve"> </w:t>
-      </w:r>
-      <w:r>
-        <w:rPr>
-          <w:rFonts w:ascii="Times New Roman" w:hAnsi="Times New Roman" w:cs="Times New Roman"/>
-        </w:rPr>
-        <w:t xml:space="preserve">      SUM(f.total_amount) AS revenue</w:t>
+        <w:t xml:space="preserve">       SUM(</w:t>
+      </w:r>
+      <w:proofErr w:type="spellStart"/>
+      <w:r>
+        <w:rPr>
+          <w:rFonts w:ascii="Times New Roman" w:hAnsi="Times New Roman" w:cs="Times New Roman"/>
+        </w:rPr>
+        <w:t>f.total_amount</w:t>
+      </w:r>
+      <w:proofErr w:type="spellEnd"/>
+      <w:r>
+        <w:rPr>
+          <w:rFonts w:ascii="Times New Roman" w:hAnsi="Times New Roman" w:cs="Times New Roman"/>
+        </w:rPr>
+        <w:t>) AS revenue</w:t>
       </w:r>
       <w:r>
         <w:rPr>
           <w:rFonts w:ascii="Times New Roman" w:hAnsi="Times New Roman" w:cs="Times New Roman"/>
         </w:rPr>
         <w:br/>
-        <w:t>FROM fact_sales f</w:t>
+        <w:t xml:space="preserve">FROM </w:t>
+      </w:r>
+      <w:proofErr w:type="spellStart"/>
+      <w:r>
+        <w:rPr>
+          <w:rFonts w:ascii="Times New Roman" w:hAnsi="Times New Roman" w:cs="Times New Roman"/>
+        </w:rPr>
+        <w:t>fact_sales</w:t>
+      </w:r>
+      <w:proofErr w:type="spellEnd"/>
+      <w:r>
+        <w:rPr>
+          <w:rFonts w:ascii="Times New Roman" w:hAnsi="Times New Roman" w:cs="Times New Roman"/>
+        </w:rPr>
+        <w:t xml:space="preserve"> f</w:t>
       </w:r>
       <w:r>
         <w:rPr>
           <w:rFonts w:ascii="Times New Roman" w:hAnsi="Times New Roman" w:cs="Times New Roman"/>
         </w:rPr>
         <w:br/>
-        <w:t>JOIN dim_product p ON f.product_key = p.product_key</w:t>
-      </w:r>
+        <w:t xml:space="preserve">JOIN </w:t>
+      </w:r>
+      <w:proofErr w:type="spellStart"/>
+      <w:r>
+        <w:rPr>
+          <w:rFonts w:ascii="Times New Roman" w:hAnsi="Times New Roman" w:cs="Times New Roman"/>
+        </w:rPr>
+        <w:t>dim_product</w:t>
+      </w:r>
+      <w:proofErr w:type="spellEnd"/>
+      <w:r>
+        <w:rPr>
+          <w:rFonts w:ascii="Times New Roman" w:hAnsi="Times New Roman" w:cs="Times New Roman"/>
+        </w:rPr>
+        <w:t xml:space="preserve"> p ON </w:t>
+      </w:r>
+      <w:proofErr w:type="spellStart"/>
+      <w:r>
+        <w:rPr>
+          <w:rFonts w:ascii="Times New Roman" w:hAnsi="Times New Roman" w:cs="Times New Roman"/>
+        </w:rPr>
+        <w:t>f.product_key</w:t>
+      </w:r>
+      <w:proofErr w:type="spellEnd"/>
+      <w:r>
+        <w:rPr>
+          <w:rFonts w:ascii="Times New Roman" w:hAnsi="Times New Roman" w:cs="Times New Roman"/>
+        </w:rPr>
+        <w:t xml:space="preserve"> = </w:t>
+      </w:r>
+      <w:proofErr w:type="spellStart"/>
+      <w:r>
+        <w:rPr>
+          <w:rFonts w:ascii="Times New Roman" w:hAnsi="Times New Roman" w:cs="Times New Roman"/>
+        </w:rPr>
+        <w:t>p.product_key</w:t>
+      </w:r>
+      <w:proofErr w:type="spellEnd"/>
       <w:r>
         <w:rPr>
           <w:rFonts w:ascii="Times New Roman" w:hAnsi="Times New Roman" w:cs="Times New Roman"/>
         </w:rPr>
         <w:br/>
-        <w:t>GROUP BY p.product_name</w:t>
-      </w:r>
+        <w:t xml:space="preserve">GROUP BY </w:t>
+      </w:r>
+      <w:proofErr w:type="spellStart"/>
+      <w:r>
+        <w:rPr>
+          <w:rFonts w:ascii="Times New Roman" w:hAnsi="Times New Roman" w:cs="Times New Roman"/>
+        </w:rPr>
+        <w:t>p.product_name</w:t>
+      </w:r>
+      <w:proofErr w:type="spellEnd"/>
       <w:r>
         <w:rPr>
           <w:rFonts w:ascii="Times New Roman" w:hAnsi="Times New Roman" w:cs="Times New Roman"/>
@@ -3327,8 +4407,59 @@
           <w:sz w:val="24"/>
           <w:szCs w:val="24"/>
         </w:rPr>
-        <w:t>3. Выручка по месяцам</w:t>
-      </w:r>
+        <w:t xml:space="preserve">3. </w:t>
+      </w:r>
+      <w:proofErr w:type="spellStart"/>
+      <w:r>
+        <w:rPr>
+          <w:rFonts w:ascii="Times New Roman" w:hAnsi="Times New Roman" w:cs="Times New Roman"/>
+          <w:color w:val="000000" w:themeColor="text1"/>
+          <w:sz w:val="24"/>
+          <w:szCs w:val="24"/>
+        </w:rPr>
+        <w:t>Выручка</w:t>
+      </w:r>
+      <w:proofErr w:type="spellEnd"/>
+      <w:r>
+        <w:rPr>
+          <w:rFonts w:ascii="Times New Roman" w:hAnsi="Times New Roman" w:cs="Times New Roman"/>
+          <w:color w:val="000000" w:themeColor="text1"/>
+          <w:sz w:val="24"/>
+          <w:szCs w:val="24"/>
+        </w:rPr>
+        <w:t xml:space="preserve"> </w:t>
+      </w:r>
+      <w:proofErr w:type="spellStart"/>
+      <w:r>
+        <w:rPr>
+          <w:rFonts w:ascii="Times New Roman" w:hAnsi="Times New Roman" w:cs="Times New Roman"/>
+          <w:color w:val="000000" w:themeColor="text1"/>
+          <w:sz w:val="24"/>
+          <w:szCs w:val="24"/>
+        </w:rPr>
+        <w:t>по</w:t>
+      </w:r>
+      <w:proofErr w:type="spellEnd"/>
+      <w:r>
+        <w:rPr>
+          <w:rFonts w:ascii="Times New Roman" w:hAnsi="Times New Roman" w:cs="Times New Roman"/>
+          <w:color w:val="000000" w:themeColor="text1"/>
+          <w:sz w:val="24"/>
+          <w:szCs w:val="24"/>
+        </w:rPr>
+        <w:t xml:space="preserve"> </w:t>
+      </w:r>
+      <w:proofErr w:type="spellStart"/>
+      <w:r>
+        <w:rPr>
+          <w:rFonts w:ascii="Times New Roman" w:hAnsi="Times New Roman" w:cs="Times New Roman"/>
+          <w:color w:val="000000" w:themeColor="text1"/>
+          <w:sz w:val="24"/>
+          <w:szCs w:val="24"/>
+        </w:rPr>
+        <w:t>месяцам</w:t>
+      </w:r>
+      <w:proofErr w:type="spellEnd"/>
     </w:p>
     <w:p>
       <w:pPr>
@@ -3340,38 +4471,178 @@
         <w:rPr>
           <w:rFonts w:ascii="Times New Roman" w:hAnsi="Times New Roman" w:cs="Times New Roman"/>
         </w:rPr>
-        <w:t>SELECT d.year, d.month, SUM(f.total_amount) AS revenue</w:t>
+        <w:t xml:space="preserve">SELECT </w:t>
+      </w:r>
+      <w:proofErr w:type="spellStart"/>
+      <w:r>
+        <w:rPr>
+          <w:rFonts w:ascii="Times New Roman" w:hAnsi="Times New Roman" w:cs="Times New Roman"/>
+        </w:rPr>
+        <w:t>d.year</w:t>
+      </w:r>
+      <w:proofErr w:type="spellEnd"/>
+      <w:r>
+        <w:rPr>
+          <w:rFonts w:ascii="Times New Roman" w:hAnsi="Times New Roman" w:cs="Times New Roman"/>
+        </w:rPr>
+        <w:t xml:space="preserve">, </w:t>
+      </w:r>
+      <w:proofErr w:type="spellStart"/>
+      <w:r>
+        <w:rPr>
+          <w:rFonts w:ascii="Times New Roman" w:hAnsi="Times New Roman" w:cs="Times New Roman"/>
+        </w:rPr>
+        <w:t>d.month</w:t>
+      </w:r>
+      <w:proofErr w:type="spellEnd"/>
+      <w:r>
+        <w:rPr>
+          <w:rFonts w:ascii="Times New Roman" w:hAnsi="Times New Roman" w:cs="Times New Roman"/>
+        </w:rPr>
+        <w:t>, SUM(</w:t>
+      </w:r>
+      <w:proofErr w:type="spellStart"/>
+      <w:r>
+        <w:rPr>
+          <w:rFonts w:ascii="Times New Roman" w:hAnsi="Times New Roman" w:cs="Times New Roman"/>
+        </w:rPr>
+        <w:t>f.total_amount</w:t>
+      </w:r>
+      <w:proofErr w:type="spellEnd"/>
+      <w:r>
+        <w:rPr>
+          <w:rFonts w:ascii="Times New Roman" w:hAnsi="Times New Roman" w:cs="Times New Roman"/>
+        </w:rPr>
+        <w:t>) AS revenue</w:t>
       </w:r>
       <w:r>
         <w:rPr>
           <w:rFonts w:ascii="Times New Roman" w:hAnsi="Times New Roman" w:cs="Times New Roman"/>
         </w:rPr>
         <w:br/>
-        <w:t>FROM fact_sales f</w:t>
+        <w:t xml:space="preserve">FROM </w:t>
+      </w:r>
+      <w:proofErr w:type="spellStart"/>
+      <w:r>
+        <w:rPr>
+          <w:rFonts w:ascii="Times New Roman" w:hAnsi="Times New Roman" w:cs="Times New Roman"/>
+        </w:rPr>
+        <w:t>fact_sales</w:t>
+      </w:r>
+      <w:proofErr w:type="spellEnd"/>
+      <w:r>
+        <w:rPr>
+          <w:rFonts w:ascii="Times New Roman" w:hAnsi="Times New Roman" w:cs="Times New Roman"/>
+        </w:rPr>
+        <w:t xml:space="preserve"> f</w:t>
       </w:r>
       <w:r>
         <w:rPr>
           <w:rFonts w:ascii="Times New Roman" w:hAnsi="Times New Roman" w:cs="Times New Roman"/>
         </w:rPr>
         <w:br/>
-        <w:t>JOIN dim_date d ON f.date_key = d.date_key</w:t>
-      </w:r>
+        <w:t xml:space="preserve">JOIN </w:t>
+      </w:r>
+      <w:proofErr w:type="spellStart"/>
+      <w:r>
+        <w:rPr>
+          <w:rFonts w:ascii="Times New Roman" w:hAnsi="Times New Roman" w:cs="Times New Roman"/>
+        </w:rPr>
+        <w:t>dim_date</w:t>
+      </w:r>
+      <w:proofErr w:type="spellEnd"/>
+      <w:r>
+        <w:rPr>
+          <w:rFonts w:ascii="Times New Roman" w:hAnsi="Times New Roman" w:cs="Times New Roman"/>
+        </w:rPr>
+        <w:t xml:space="preserve"> d ON </w:t>
+      </w:r>
+      <w:proofErr w:type="spellStart"/>
+      <w:r>
+        <w:rPr>
+          <w:rFonts w:ascii="Times New Roman" w:hAnsi="Times New Roman" w:cs="Times New Roman"/>
+        </w:rPr>
+        <w:t>f.date_key</w:t>
+      </w:r>
+      <w:proofErr w:type="spellEnd"/>
+      <w:r>
+        <w:rPr>
+          <w:rFonts w:ascii="Times New Roman" w:hAnsi="Times New Roman" w:cs="Times New Roman"/>
+        </w:rPr>
+        <w:t xml:space="preserve"> = </w:t>
+      </w:r>
+      <w:proofErr w:type="spellStart"/>
+      <w:r>
+        <w:rPr>
+          <w:rFonts w:ascii="Times New Roman" w:hAnsi="Times New Roman" w:cs="Times New Roman"/>
+        </w:rPr>
+        <w:t>d.date_key</w:t>
+      </w:r>
+      <w:proofErr w:type="spellEnd"/>
       <w:r>
         <w:rPr>
           <w:rFonts w:ascii="Times New Roman" w:hAnsi="Times New Roman" w:cs="Times New Roman"/>
         </w:rPr>
         <w:br/>
-        <w:t>GROUP BY d.year, d.month</w:t>
-      </w:r>
+        <w:t xml:space="preserve">GROUP BY </w:t>
+      </w:r>
+      <w:proofErr w:type="spellStart"/>
+      <w:r>
+        <w:rPr>
+          <w:rFonts w:ascii="Times New Roman" w:hAnsi="Times New Roman" w:cs="Times New Roman"/>
+        </w:rPr>
+        <w:t>d.year</w:t>
+      </w:r>
+      <w:proofErr w:type="spellEnd"/>
+      <w:r>
+        <w:rPr>
+          <w:rFonts w:ascii="Times New Roman" w:hAnsi="Times New Roman" w:cs="Times New Roman"/>
+        </w:rPr>
+        <w:t xml:space="preserve">, </w:t>
+      </w:r>
+      <w:proofErr w:type="spellStart"/>
+      <w:r>
+        <w:rPr>
+          <w:rFonts w:ascii="Times New Roman" w:hAnsi="Times New Roman" w:cs="Times New Roman"/>
+        </w:rPr>
+        <w:t>d.month</w:t>
+      </w:r>
+      <w:proofErr w:type="spellEnd"/>
       <w:r>
         <w:rPr>
           <w:rFonts w:ascii="Times New Roman" w:hAnsi="Times New Roman" w:cs="Times New Roman"/>
         </w:rPr>
         <w:br/>
-        <w:t>ORDER BY d.year, d.month;</w:t>
-      </w:r>
-      <w:bookmarkStart w:id="0" w:name="_GoBack"/>
-      <w:bookmarkEnd w:id="0"/>
+        <w:t xml:space="preserve">ORDER BY </w:t>
+      </w:r>
+      <w:proofErr w:type="spellStart"/>
+      <w:r>
+        <w:rPr>
+          <w:rFonts w:ascii="Times New Roman" w:hAnsi="Times New Roman" w:cs="Times New Roman"/>
+        </w:rPr>
+        <w:t>d.year</w:t>
+      </w:r>
+      <w:proofErr w:type="spellEnd"/>
+      <w:r>
+        <w:rPr>
+          <w:rFonts w:ascii="Times New Roman" w:hAnsi="Times New Roman" w:cs="Times New Roman"/>
+        </w:rPr>
+        <w:t xml:space="preserve">, </w:t>
+      </w:r>
+      <w:proofErr w:type="spellStart"/>
+      <w:r>
+        <w:rPr>
+          <w:rFonts w:ascii="Times New Roman" w:hAnsi="Times New Roman" w:cs="Times New Roman"/>
+        </w:rPr>
+        <w:t>d.month</w:t>
+      </w:r>
+      <w:proofErr w:type="spellEnd"/>
+      <w:r>
+        <w:rPr>
+          <w:rFonts w:ascii="Times New Roman" w:hAnsi="Times New Roman" w:cs="Times New Roman"/>
+        </w:rPr>
+        <w:t>;</w:t>
+      </w:r>
     </w:p>
     <w:sectPr>
       <w:footerReference w:type="default" r:id="rId8"/>
@@ -3440,7 +4711,7 @@
         <w:sz w:val="18"/>
         <w:szCs w:val="18"/>
       </w:rPr>
-      <w:t>2</w:t>
+      <w:t>3</w:t>
     </w:r>
     <w:r>
       <w:rPr>

</xml_diff>